<commit_message>
finished the 5.3 question
</commit_message>
<xml_diff>
--- a/advcomparch-ex1-helpcode/docs/AdvCompArch_1_03121644.docx
+++ b/advcomparch-ex1-helpcode/docs/AdvCompArch_1_03121644.docx
@@ -304,10 +304,9 @@
               <w:jc w:val="center"/>
               <w:rPr>
                 <w:rFonts w:ascii="Times New Roman" w:eastAsia="Times New Roman" w:hAnsi="Times New Roman" w:cs="Times New Roman"/>
+                <w:color w:val="000000"/>
                 <w:kern w:val="0"/>
-                <w:sz w:val="24"/>
-                <w:szCs w:val="24"/>
-                <w:lang w:val="el-GR" w:eastAsia="en-GB"/>
+                <w:lang w:val="en-US" w:eastAsia="en-GB"/>
                 <w14:ligatures w14:val="none"/>
               </w:rPr>
             </w:pPr>
@@ -360,6 +359,40 @@
                 <w14:ligatures w14:val="none"/>
               </w:rPr>
               <w:t xml:space="preserve"> 03121644</w:t>
+            </w:r>
+          </w:p>
+          <w:p>
+            <w:pPr>
+              <w:spacing w:after="0" w:line="240" w:lineRule="auto"/>
+              <w:jc w:val="center"/>
+              <w:rPr>
+                <w:rFonts w:ascii="Times New Roman" w:eastAsia="Times New Roman" w:hAnsi="Times New Roman" w:cs="Times New Roman"/>
+                <w:kern w:val="0"/>
+                <w:sz w:val="24"/>
+                <w:szCs w:val="24"/>
+                <w:lang w:val="en-US" w:eastAsia="en-GB"/>
+                <w14:ligatures w14:val="none"/>
+              </w:rPr>
+            </w:pPr>
+            <w:r>
+              <w:rPr>
+                <w:rFonts w:ascii="Times New Roman" w:eastAsia="Times New Roman" w:hAnsi="Times New Roman" w:cs="Times New Roman"/>
+                <w:color w:val="000000"/>
+                <w:kern w:val="0"/>
+                <w:lang w:val="en-US" w:eastAsia="en-GB"/>
+                <w14:ligatures w14:val="none"/>
+              </w:rPr>
+              <w:t xml:space="preserve">Github repo: </w:t>
+            </w:r>
+            <w:r>
+              <w:rPr>
+                <w:rFonts w:ascii="Times New Roman" w:eastAsia="Times New Roman" w:hAnsi="Times New Roman" w:cs="Times New Roman"/>
+                <w:color w:val="000000"/>
+                <w:kern w:val="0"/>
+                <w:lang w:val="en-US" w:eastAsia="en-GB"/>
+                <w14:ligatures w14:val="none"/>
+              </w:rPr>
+              <w:t>https://github.com/Sskarm/advcomparch.git</w:t>
             </w:r>
           </w:p>
         </w:tc>
@@ -368,7 +401,7 @@
     <w:p>
       <w:pPr>
         <w:rPr>
-          <w:lang w:val="el-GR"/>
+          <w:lang w:val="en-US"/>
         </w:rPr>
       </w:pPr>
     </w:p>
@@ -385,49 +418,7 @@
         <w:rPr>
           <w:rFonts w:ascii="Times New Roman" w:hAnsi="Times New Roman" w:cs="Times New Roman"/>
         </w:rPr>
-        <w:t xml:space="preserve">Άσκηση 1η: </w:t>
-      </w:r>
-      <w:proofErr w:type="spellStart"/>
-      <w:r>
-        <w:rPr>
-          <w:rFonts w:ascii="Times New Roman" w:hAnsi="Times New Roman" w:cs="Times New Roman"/>
-        </w:rPr>
-        <w:t>Πρό</w:t>
-      </w:r>
-      <w:proofErr w:type="spellEnd"/>
-      <w:r>
-        <w:rPr>
-          <w:rFonts w:ascii="Times New Roman" w:hAnsi="Times New Roman" w:cs="Times New Roman"/>
-        </w:rPr>
-        <w:t xml:space="preserve">βλεψη </w:t>
-      </w:r>
-      <w:proofErr w:type="spellStart"/>
-      <w:r>
-        <w:rPr>
-          <w:rFonts w:ascii="Times New Roman" w:hAnsi="Times New Roman" w:cs="Times New Roman"/>
-        </w:rPr>
-        <w:t>Εντολών</w:t>
-      </w:r>
-      <w:proofErr w:type="spellEnd"/>
-      <w:r>
-        <w:rPr>
-          <w:rFonts w:ascii="Times New Roman" w:hAnsi="Times New Roman" w:cs="Times New Roman"/>
-        </w:rPr>
-        <w:t xml:space="preserve"> </w:t>
-      </w:r>
-      <w:proofErr w:type="spellStart"/>
-      <w:r>
-        <w:rPr>
-          <w:rFonts w:ascii="Times New Roman" w:hAnsi="Times New Roman" w:cs="Times New Roman"/>
-        </w:rPr>
-        <w:t>Άλμ</w:t>
-      </w:r>
-      <w:proofErr w:type="spellEnd"/>
-      <w:r>
-        <w:rPr>
-          <w:rFonts w:ascii="Times New Roman" w:hAnsi="Times New Roman" w:cs="Times New Roman"/>
-        </w:rPr>
-        <w:t>ατος</w:t>
+        <w:t>Άσκηση 1η: Πρόβλεψη Εντολών Άλματος</w:t>
       </w:r>
     </w:p>
     <w:p>
@@ -568,7 +559,6 @@
         </w:rPr>
         <w:t>1. 403.</w:t>
       </w:r>
-      <w:proofErr w:type="spellStart"/>
       <w:r>
         <w:rPr>
           <w:rFonts w:ascii="Times New Roman" w:hAnsi="Times New Roman" w:cs="Times New Roman"/>
@@ -577,7 +567,6 @@
         </w:rPr>
         <w:t>gcc</w:t>
       </w:r>
-      <w:proofErr w:type="spellEnd"/>
       <w:r>
         <w:rPr>
           <w:rFonts w:ascii="Times New Roman" w:hAnsi="Times New Roman" w:cs="Times New Roman"/>
@@ -587,7 +576,6 @@
         </w:rPr>
         <w:t xml:space="preserve">              2. 410.</w:t>
       </w:r>
-      <w:proofErr w:type="spellStart"/>
       <w:r>
         <w:rPr>
           <w:rFonts w:ascii="Times New Roman" w:hAnsi="Times New Roman" w:cs="Times New Roman"/>
@@ -596,7 +584,6 @@
         </w:rPr>
         <w:t>bwaves</w:t>
       </w:r>
-      <w:proofErr w:type="spellEnd"/>
       <w:r>
         <w:rPr>
           <w:rFonts w:ascii="Times New Roman" w:hAnsi="Times New Roman" w:cs="Times New Roman"/>
@@ -606,7 +593,6 @@
         </w:rPr>
         <w:t xml:space="preserve">            3. 416.</w:t>
       </w:r>
-      <w:proofErr w:type="spellStart"/>
       <w:r>
         <w:rPr>
           <w:rFonts w:ascii="Times New Roman" w:hAnsi="Times New Roman" w:cs="Times New Roman"/>
@@ -615,7 +601,6 @@
         </w:rPr>
         <w:t>gamess</w:t>
       </w:r>
-      <w:proofErr w:type="spellEnd"/>
       <w:r>
         <w:rPr>
           <w:rFonts w:ascii="Times New Roman" w:hAnsi="Times New Roman" w:cs="Times New Roman"/>
@@ -661,7 +646,6 @@
         </w:rPr>
         <w:t>5. 433.</w:t>
       </w:r>
-      <w:proofErr w:type="spellStart"/>
       <w:r>
         <w:rPr>
           <w:rFonts w:ascii="Times New Roman" w:hAnsi="Times New Roman" w:cs="Times New Roman"/>
@@ -670,7 +654,6 @@
         </w:rPr>
         <w:t>milc</w:t>
       </w:r>
-      <w:proofErr w:type="spellEnd"/>
       <w:r>
         <w:rPr>
           <w:rFonts w:ascii="Times New Roman" w:hAnsi="Times New Roman" w:cs="Times New Roman"/>
@@ -698,7 +681,6 @@
         </w:rPr>
         <w:t>6. 435.</w:t>
       </w:r>
-      <w:proofErr w:type="spellStart"/>
       <w:r>
         <w:rPr>
           <w:rFonts w:ascii="Times New Roman" w:hAnsi="Times New Roman" w:cs="Times New Roman"/>
@@ -707,7 +689,6 @@
         </w:rPr>
         <w:t>gromacs</w:t>
       </w:r>
-      <w:proofErr w:type="spellEnd"/>
       <w:r>
         <w:rPr>
           <w:rFonts w:ascii="Times New Roman" w:hAnsi="Times New Roman" w:cs="Times New Roman"/>
@@ -735,7 +716,6 @@
         </w:rPr>
         <w:t>7. 436.</w:t>
       </w:r>
-      <w:proofErr w:type="spellStart"/>
       <w:r>
         <w:rPr>
           <w:rFonts w:ascii="Times New Roman" w:hAnsi="Times New Roman" w:cs="Times New Roman"/>
@@ -744,7 +724,6 @@
         </w:rPr>
         <w:t>cactusADM</w:t>
       </w:r>
-      <w:proofErr w:type="spellEnd"/>
       <w:r>
         <w:rPr>
           <w:rFonts w:ascii="Times New Roman" w:hAnsi="Times New Roman" w:cs="Times New Roman"/>
@@ -772,7 +751,6 @@
         </w:rPr>
         <w:t>8. 450.</w:t>
       </w:r>
-      <w:proofErr w:type="spellStart"/>
       <w:r>
         <w:rPr>
           <w:rFonts w:ascii="Times New Roman" w:hAnsi="Times New Roman" w:cs="Times New Roman"/>
@@ -781,7 +759,6 @@
         </w:rPr>
         <w:t>soplex</w:t>
       </w:r>
-      <w:proofErr w:type="spellEnd"/>
       <w:r>
         <w:rPr>
           <w:rFonts w:ascii="Times New Roman" w:hAnsi="Times New Roman" w:cs="Times New Roman"/>
@@ -810,7 +787,6 @@
         </w:rPr>
         <w:t>9. 459.</w:t>
       </w:r>
-      <w:proofErr w:type="spellStart"/>
       <w:r>
         <w:rPr>
           <w:rFonts w:ascii="Times New Roman" w:hAnsi="Times New Roman" w:cs="Times New Roman"/>
@@ -819,7 +795,6 @@
         </w:rPr>
         <w:t>GemsFDTD</w:t>
       </w:r>
-      <w:proofErr w:type="spellEnd"/>
       <w:r>
         <w:rPr>
           <w:rFonts w:ascii="Times New Roman" w:hAnsi="Times New Roman" w:cs="Times New Roman"/>
@@ -847,7 +822,6 @@
         </w:rPr>
         <w:t>10. 470.</w:t>
       </w:r>
-      <w:proofErr w:type="spellStart"/>
       <w:r>
         <w:rPr>
           <w:rFonts w:ascii="Times New Roman" w:hAnsi="Times New Roman" w:cs="Times New Roman"/>
@@ -856,7 +830,6 @@
         </w:rPr>
         <w:t>lbm</w:t>
       </w:r>
-      <w:proofErr w:type="spellEnd"/>
       <w:r>
         <w:rPr>
           <w:rFonts w:ascii="Times New Roman" w:hAnsi="Times New Roman" w:cs="Times New Roman"/>
@@ -884,7 +857,6 @@
         </w:rPr>
         <w:t>11. 483.</w:t>
       </w:r>
-      <w:proofErr w:type="spellStart"/>
       <w:r>
         <w:rPr>
           <w:rFonts w:ascii="Times New Roman" w:hAnsi="Times New Roman" w:cs="Times New Roman"/>
@@ -893,7 +865,6 @@
         </w:rPr>
         <w:t>xalancbmk</w:t>
       </w:r>
-      <w:proofErr w:type="spellEnd"/>
     </w:p>
     <w:p>
       <w:pPr>
@@ -1127,7 +1098,6 @@
         </w:rPr>
         <w:t xml:space="preserve">Χρησιμοποιούμε το </w:t>
       </w:r>
-      <w:proofErr w:type="spellStart"/>
       <w:r>
         <w:rPr>
           <w:rFonts w:ascii="Times New Roman" w:hAnsi="Times New Roman" w:cs="Times New Roman"/>
@@ -1136,7 +1106,6 @@
         </w:rPr>
         <w:t>cslab</w:t>
       </w:r>
-      <w:proofErr w:type="spellEnd"/>
       <w:r>
         <w:rPr>
           <w:rFonts w:ascii="Times New Roman" w:hAnsi="Times New Roman" w:cs="Times New Roman"/>
@@ -1180,7 +1149,6 @@
         </w:rPr>
         <w:t>.</w:t>
       </w:r>
-      <w:proofErr w:type="spellStart"/>
       <w:r>
         <w:rPr>
           <w:rFonts w:ascii="Times New Roman" w:hAnsi="Times New Roman" w:cs="Times New Roman"/>
@@ -1189,7 +1157,6 @@
         </w:rPr>
         <w:t>cpp</w:t>
       </w:r>
-      <w:proofErr w:type="spellEnd"/>
       <w:r>
         <w:rPr>
           <w:rFonts w:ascii="Times New Roman" w:hAnsi="Times New Roman" w:cs="Times New Roman"/>
@@ -1565,19 +1532,8 @@
                 <w:szCs w:val="24"/>
                 <w:lang w:val="en-US"/>
               </w:rPr>
-              <w:t xml:space="preserve">Conditional </w:t>
-            </w:r>
-            <w:proofErr w:type="gramStart"/>
-            <w:r>
-              <w:rPr>
-                <w:rFonts w:ascii="Times New Roman" w:hAnsi="Times New Roman" w:cs="Times New Roman"/>
-                <w:sz w:val="24"/>
-                <w:szCs w:val="24"/>
-                <w:lang w:val="en-US"/>
-              </w:rPr>
-              <w:t>Non-Taken</w:t>
-            </w:r>
-            <w:proofErr w:type="gramEnd"/>
+              <w:t>Conditional Non-Taken</w:t>
+            </w:r>
           </w:p>
         </w:tc>
         <w:tc>
@@ -1683,7 +1639,6 @@
               </w:rPr>
               <w:t>403.</w:t>
             </w:r>
-            <w:proofErr w:type="spellStart"/>
             <w:r>
               <w:rPr>
                 <w:rFonts w:ascii="Times New Roman" w:hAnsi="Times New Roman" w:cs="Times New Roman"/>
@@ -1692,7 +1647,6 @@
               </w:rPr>
               <w:t>gcc</w:t>
             </w:r>
-            <w:proofErr w:type="spellEnd"/>
             <w:r>
               <w:rPr>
                 <w:rFonts w:ascii="Times New Roman" w:hAnsi="Times New Roman" w:cs="Times New Roman"/>
@@ -3671,17 +3625,7 @@
           <w:szCs w:val="24"/>
           <w:lang w:val="el-GR"/>
         </w:rPr>
-        <w:t xml:space="preserve"> τις </w:t>
-      </w:r>
-      <w:proofErr w:type="spellStart"/>
-      <w:r>
-        <w:rPr>
-          <w:rFonts w:ascii="Times New Roman" w:hAnsi="Times New Roman" w:cs="Times New Roman"/>
-          <w:sz w:val="24"/>
-          <w:szCs w:val="24"/>
-          <w:lang w:val="el-GR"/>
-        </w:rPr>
-        <w:t>εκατ</w:t>
+        <w:t xml:space="preserve"> τις εκατ</w:t>
       </w:r>
       <w:r>
         <w:rPr>
@@ -3692,7 +3636,6 @@
         </w:rPr>
         <w:t>ώ</w:t>
       </w:r>
-      <w:proofErr w:type="spellEnd"/>
       <w:r>
         <w:rPr>
           <w:rFonts w:ascii="Times New Roman" w:hAnsi="Times New Roman" w:cs="Times New Roman"/>
@@ -3896,19 +3839,8 @@
                 <w:szCs w:val="24"/>
                 <w:lang w:val="en-US"/>
               </w:rPr>
-              <w:t xml:space="preserve">Conditional </w:t>
-            </w:r>
-            <w:proofErr w:type="gramStart"/>
-            <w:r>
-              <w:rPr>
-                <w:rFonts w:ascii="Times New Roman" w:hAnsi="Times New Roman" w:cs="Times New Roman"/>
-                <w:sz w:val="24"/>
-                <w:szCs w:val="24"/>
-                <w:lang w:val="en-US"/>
-              </w:rPr>
-              <w:t>Non-Taken</w:t>
-            </w:r>
-            <w:proofErr w:type="gramEnd"/>
+              <w:t>Conditional Non-Taken</w:t>
+            </w:r>
           </w:p>
         </w:tc>
         <w:tc>
@@ -4014,7 +3946,6 @@
               </w:rPr>
               <w:t>403.</w:t>
             </w:r>
-            <w:proofErr w:type="spellStart"/>
             <w:r>
               <w:rPr>
                 <w:rFonts w:ascii="Times New Roman" w:hAnsi="Times New Roman" w:cs="Times New Roman"/>
@@ -4023,7 +3954,6 @@
               </w:rPr>
               <w:t>gcc</w:t>
             </w:r>
-            <w:proofErr w:type="spellEnd"/>
             <w:r>
               <w:rPr>
                 <w:rFonts w:ascii="Times New Roman" w:hAnsi="Times New Roman" w:cs="Times New Roman"/>
@@ -5878,19 +5808,8 @@
                 <w:szCs w:val="24"/>
                 <w:lang w:val="en-US"/>
               </w:rPr>
-              <w:t xml:space="preserve">Conditional </w:t>
-            </w:r>
-            <w:proofErr w:type="gramStart"/>
-            <w:r>
-              <w:rPr>
-                <w:rFonts w:ascii="Times New Roman" w:hAnsi="Times New Roman" w:cs="Times New Roman"/>
-                <w:sz w:val="24"/>
-                <w:szCs w:val="24"/>
-                <w:lang w:val="en-US"/>
-              </w:rPr>
-              <w:t>Non-Taken</w:t>
-            </w:r>
-            <w:proofErr w:type="gramEnd"/>
+              <w:t>Conditional Non-Taken</w:t>
+            </w:r>
           </w:p>
         </w:tc>
         <w:tc>
@@ -5996,7 +5915,6 @@
               </w:rPr>
               <w:t>403.</w:t>
             </w:r>
-            <w:proofErr w:type="spellStart"/>
             <w:r>
               <w:rPr>
                 <w:rFonts w:ascii="Times New Roman" w:hAnsi="Times New Roman" w:cs="Times New Roman"/>
@@ -6005,7 +5923,6 @@
               </w:rPr>
               <w:t>gcc</w:t>
             </w:r>
-            <w:proofErr w:type="spellEnd"/>
             <w:r>
               <w:rPr>
                 <w:rFonts w:ascii="Times New Roman" w:hAnsi="Times New Roman" w:cs="Times New Roman"/>
@@ -7984,17 +7901,7 @@
           <w:szCs w:val="24"/>
           <w:lang w:val="el-GR"/>
         </w:rPr>
-        <w:t xml:space="preserve">τις </w:t>
-      </w:r>
-      <w:proofErr w:type="spellStart"/>
-      <w:r>
-        <w:rPr>
-          <w:rFonts w:ascii="Times New Roman" w:hAnsi="Times New Roman" w:cs="Times New Roman"/>
-          <w:sz w:val="24"/>
-          <w:szCs w:val="24"/>
-          <w:lang w:val="el-GR"/>
-        </w:rPr>
-        <w:t>εκατ</w:t>
+        <w:t>τις εκατ</w:t>
       </w:r>
       <w:r>
         <w:rPr>
@@ -8005,7 +7912,6 @@
         </w:rPr>
         <w:t>ώ</w:t>
       </w:r>
-      <w:proofErr w:type="spellEnd"/>
       <w:r>
         <w:rPr>
           <w:rFonts w:ascii="Times New Roman" w:hAnsi="Times New Roman" w:cs="Times New Roman"/>
@@ -8210,19 +8116,8 @@
                 <w:szCs w:val="24"/>
                 <w:lang w:val="en-US"/>
               </w:rPr>
-              <w:t xml:space="preserve">Conditional </w:t>
-            </w:r>
-            <w:proofErr w:type="gramStart"/>
-            <w:r>
-              <w:rPr>
-                <w:rFonts w:ascii="Times New Roman" w:hAnsi="Times New Roman" w:cs="Times New Roman"/>
-                <w:sz w:val="24"/>
-                <w:szCs w:val="24"/>
-                <w:lang w:val="en-US"/>
-              </w:rPr>
-              <w:t>Non-Taken</w:t>
-            </w:r>
-            <w:proofErr w:type="gramEnd"/>
+              <w:t>Conditional Non-Taken</w:t>
+            </w:r>
           </w:p>
         </w:tc>
         <w:tc>
@@ -8328,7 +8223,6 @@
               </w:rPr>
               <w:t>403.</w:t>
             </w:r>
-            <w:proofErr w:type="spellStart"/>
             <w:r>
               <w:rPr>
                 <w:rFonts w:ascii="Times New Roman" w:hAnsi="Times New Roman" w:cs="Times New Roman"/>
@@ -8337,7 +8231,6 @@
               </w:rPr>
               <w:t>gcc</w:t>
             </w:r>
-            <w:proofErr w:type="spellEnd"/>
           </w:p>
         </w:tc>
         <w:tc>
@@ -10171,14 +10064,12 @@
         </w:rPr>
         <w:t xml:space="preserve"> </w:t>
       </w:r>
-      <w:proofErr w:type="spellStart"/>
       <w:r>
         <w:rPr>
           <w:rFonts w:ascii="Times New Roman" w:hAnsi="Times New Roman" w:cs="Times New Roman"/>
         </w:rPr>
         <w:t>cslab</w:t>
       </w:r>
-      <w:proofErr w:type="spellEnd"/>
       <w:r>
         <w:rPr>
           <w:rFonts w:ascii="Times New Roman" w:hAnsi="Times New Roman" w:cs="Times New Roman"/>
@@ -10199,14 +10090,12 @@
         </w:rPr>
         <w:t>.</w:t>
       </w:r>
-      <w:proofErr w:type="spellStart"/>
       <w:r>
         <w:rPr>
           <w:rFonts w:ascii="Times New Roman" w:hAnsi="Times New Roman" w:cs="Times New Roman"/>
         </w:rPr>
         <w:t>cpp</w:t>
       </w:r>
-      <w:proofErr w:type="spellEnd"/>
       <w:r>
         <w:rPr>
           <w:rFonts w:ascii="Times New Roman" w:hAnsi="Times New Roman" w:cs="Times New Roman"/>
@@ -10228,14 +10117,12 @@
         </w:rPr>
         <w:t xml:space="preserve"> </w:t>
       </w:r>
-      <w:proofErr w:type="spellStart"/>
       <w:r>
         <w:rPr>
           <w:rFonts w:ascii="Times New Roman" w:hAnsi="Times New Roman" w:cs="Times New Roman"/>
         </w:rPr>
         <w:t>NbitPredictor</w:t>
       </w:r>
-      <w:proofErr w:type="spellEnd"/>
       <w:r>
         <w:rPr>
           <w:rFonts w:ascii="Times New Roman" w:hAnsi="Times New Roman" w:cs="Times New Roman"/>
@@ -10271,7 +10158,6 @@
         </w:rPr>
         <w:t xml:space="preserve">  (14,1) , (14,2), (14,3) , (14,4) </w:t>
       </w:r>
-      <w:proofErr w:type="spellStart"/>
       <w:r>
         <w:rPr>
           <w:rFonts w:ascii="Times New Roman" w:hAnsi="Times New Roman" w:cs="Times New Roman"/>
@@ -10279,7 +10165,6 @@
         </w:rPr>
         <w:t>αρα</w:t>
       </w:r>
-      <w:proofErr w:type="spellEnd"/>
       <w:r>
         <w:rPr>
           <w:rFonts w:ascii="Times New Roman" w:hAnsi="Times New Roman" w:cs="Times New Roman"/>
@@ -10327,7 +10212,6 @@
         </w:rPr>
         <w:t xml:space="preserve"> 1 </w:t>
       </w:r>
-      <w:proofErr w:type="spellStart"/>
       <w:r>
         <w:rPr>
           <w:rFonts w:ascii="Times New Roman" w:hAnsi="Times New Roman" w:cs="Times New Roman"/>
@@ -10335,7 +10219,6 @@
         </w:rPr>
         <w:t>εως</w:t>
       </w:r>
-      <w:proofErr w:type="spellEnd"/>
       <w:r>
         <w:rPr>
           <w:rFonts w:ascii="Times New Roman" w:hAnsi="Times New Roman" w:cs="Times New Roman"/>
@@ -16466,7 +16349,6 @@
         </w:rPr>
         <w:t xml:space="preserve">οπότε θα διάλεγα τον </w:t>
       </w:r>
-      <w:proofErr w:type="spellStart"/>
       <w:r>
         <w:rPr>
           <w:rFonts w:ascii="Times New Roman" w:hAnsi="Times New Roman" w:cs="Times New Roman"/>
@@ -16475,7 +16357,6 @@
         </w:rPr>
         <w:t>Nbit</w:t>
       </w:r>
-      <w:proofErr w:type="spellEnd"/>
       <w:r>
         <w:rPr>
           <w:rFonts w:ascii="Times New Roman" w:hAnsi="Times New Roman" w:cs="Times New Roman"/>
@@ -16698,14 +16579,12 @@
         </w:rPr>
         <w:t>2</w:t>
       </w:r>
-      <w:proofErr w:type="spellStart"/>
       <w:r>
         <w:rPr>
           <w:rFonts w:ascii="Times New Roman" w:hAnsi="Times New Roman" w:cs="Times New Roman"/>
         </w:rPr>
         <w:t>BitPredictor</w:t>
       </w:r>
-      <w:proofErr w:type="spellEnd"/>
       <w:r>
         <w:rPr>
           <w:rFonts w:ascii="Times New Roman" w:hAnsi="Times New Roman" w:cs="Times New Roman"/>
@@ -16716,6 +16595,7 @@
       <w:r>
         <w:rPr>
           <w:rFonts w:ascii="Times New Roman" w:hAnsi="Times New Roman" w:cs="Times New Roman"/>
+          <w:noProof/>
           <w:lang w:val="el-GR"/>
         </w:rPr>
         <w:drawing>
@@ -16846,7 +16726,6 @@
         </w:rPr>
         <w:t xml:space="preserve"> </w:t>
       </w:r>
-      <w:proofErr w:type="spellStart"/>
       <w:r>
         <w:rPr>
           <w:rFonts w:ascii="Times New Roman" w:hAnsi="Times New Roman" w:cs="Times New Roman"/>
@@ -16856,7 +16735,6 @@
         </w:rPr>
         <w:t>BranchPredictor</w:t>
       </w:r>
-      <w:proofErr w:type="spellEnd"/>
       <w:r>
         <w:rPr>
           <w:rFonts w:ascii="Times New Roman" w:hAnsi="Times New Roman" w:cs="Times New Roman"/>
@@ -17177,7 +17055,6 @@
         </w:rPr>
         <w:t xml:space="preserve">υπάρχει ένα </w:t>
       </w:r>
-      <w:proofErr w:type="spellStart"/>
       <w:r>
         <w:rPr>
           <w:rFonts w:ascii="Times New Roman" w:hAnsi="Times New Roman" w:cs="Times New Roman"/>
@@ -17187,7 +17064,6 @@
         </w:rPr>
         <w:t>touple</w:t>
       </w:r>
-      <w:proofErr w:type="spellEnd"/>
       <w:r>
         <w:rPr>
           <w:rFonts w:ascii="Times New Roman" w:hAnsi="Times New Roman" w:cs="Times New Roman"/>
@@ -21320,7 +21196,7 @@
           <w:rFonts w:ascii="Times New Roman" w:hAnsi="Times New Roman" w:cs="Times New Roman"/>
           <w:sz w:val="24"/>
           <w:szCs w:val="24"/>
-          <w:lang w:val="en-US"/>
+          <w:lang w:val="el-GR"/>
         </w:rPr>
       </w:pPr>
       <w:r>
@@ -21384,7 +21260,7 @@
           <w:rFonts w:ascii="Times New Roman" w:hAnsi="Times New Roman" w:cs="Times New Roman"/>
           <w:sz w:val="24"/>
           <w:szCs w:val="24"/>
-          <w:lang w:val="en-US"/>
+          <w:lang w:val="el-GR"/>
         </w:rPr>
       </w:pPr>
     </w:p>
@@ -21394,7 +21270,7 @@
           <w:rFonts w:ascii="Times New Roman" w:hAnsi="Times New Roman" w:cs="Times New Roman"/>
           <w:sz w:val="24"/>
           <w:szCs w:val="24"/>
-          <w:lang w:val="en-US"/>
+          <w:lang w:val="el-GR"/>
         </w:rPr>
       </w:pPr>
     </w:p>
@@ -23603,12 +23479,13 @@
           <w:rFonts w:ascii="Times New Roman" w:hAnsi="Times New Roman" w:cs="Times New Roman"/>
           <w:sz w:val="24"/>
           <w:szCs w:val="24"/>
-          <w:lang w:val="en-US"/>
+          <w:lang w:val="el-GR"/>
         </w:rPr>
       </w:pPr>
       <w:r>
         <w:rPr>
           <w:rFonts w:ascii="Times New Roman" w:hAnsi="Times New Roman" w:cs="Times New Roman"/>
+          <w:noProof/>
           <w:sz w:val="24"/>
           <w:szCs w:val="24"/>
           <w:lang w:val="el-GR"/>
@@ -23694,17 +23571,26 @@
           <w:rFonts w:ascii="Times New Roman" w:hAnsi="Times New Roman" w:cs="Times New Roman"/>
           <w:sz w:val="24"/>
           <w:szCs w:val="24"/>
+          <w:lang w:val="el-GR"/>
+        </w:rPr>
+      </w:pPr>
+      <w:r>
+        <w:rPr>
+          <w:rFonts w:ascii="Times New Roman" w:hAnsi="Times New Roman" w:cs="Times New Roman"/>
+          <w:sz w:val="24"/>
+          <w:szCs w:val="24"/>
+          <w:lang w:val="el-GR"/>
+        </w:rPr>
+        <w:t>1.</w:t>
+      </w:r>
+      <w:r>
+        <w:rPr>
+          <w:rFonts w:ascii="Times New Roman" w:hAnsi="Times New Roman" w:cs="Times New Roman"/>
+          <w:sz w:val="24"/>
+          <w:szCs w:val="24"/>
           <w:lang w:val="en-US"/>
         </w:rPr>
-      </w:pPr>
-      <w:r>
-        <w:rPr>
-          <w:rFonts w:ascii="Times New Roman" w:hAnsi="Times New Roman" w:cs="Times New Roman"/>
-          <w:sz w:val="24"/>
-          <w:szCs w:val="24"/>
-          <w:lang w:val="en-US"/>
-        </w:rPr>
-        <w:t>1.ABACBDCD</w:t>
+        <w:t>ABACBDCD</w:t>
       </w:r>
     </w:p>
     <w:p>
@@ -23713,7 +23599,7 @@
           <w:rFonts w:ascii="Times New Roman" w:hAnsi="Times New Roman" w:cs="Times New Roman"/>
           <w:sz w:val="24"/>
           <w:szCs w:val="24"/>
-          <w:lang w:val="en-US"/>
+          <w:lang w:val="el-GR"/>
         </w:rPr>
       </w:pPr>
     </w:p>
@@ -23835,6 +23721,7 @@
       <w:r>
         <w:rPr>
           <w:rFonts w:ascii="Times New Roman" w:hAnsi="Times New Roman" w:cs="Times New Roman"/>
+          <w:noProof/>
           <w:sz w:val="24"/>
           <w:szCs w:val="24"/>
           <w:lang w:val="el-GR"/>
@@ -23879,6 +23766,7 @@
       <w:r>
         <w:rPr>
           <w:rFonts w:ascii="Times New Roman" w:hAnsi="Times New Roman" w:cs="Times New Roman"/>
+          <w:noProof/>
           <w:sz w:val="24"/>
           <w:szCs w:val="24"/>
           <w:lang w:val="el-GR"/>
@@ -23929,6 +23817,4013 @@
           <w:lang w:val="en-US"/>
         </w:rPr>
       </w:pPr>
+      <w:r>
+        <w:rPr>
+          <w:rFonts w:ascii="Times New Roman" w:hAnsi="Times New Roman" w:cs="Times New Roman"/>
+          <w:sz w:val="24"/>
+          <w:szCs w:val="24"/>
+          <w:lang w:val="en-US"/>
+        </w:rPr>
+        <w:lastRenderedPageBreak/>
+        <w:t>5.3</w:t>
+      </w:r>
+    </w:p>
+    <w:p>
+      <w:pPr>
+        <w:ind w:firstLine="720"/>
+        <w:rPr>
+          <w:rFonts w:ascii="Times New Roman" w:hAnsi="Times New Roman" w:cs="Times New Roman"/>
+          <w:sz w:val="24"/>
+          <w:szCs w:val="24"/>
+          <w:lang w:val="en-US"/>
+        </w:rPr>
+      </w:pPr>
+      <w:r>
+        <w:rPr>
+          <w:rFonts w:ascii="Times New Roman" w:hAnsi="Times New Roman" w:cs="Times New Roman"/>
+          <w:sz w:val="24"/>
+          <w:szCs w:val="24"/>
+          <w:lang w:val="en-US"/>
+        </w:rPr>
+        <w:t xml:space="preserve"> </w:t>
+      </w:r>
+      <w:r>
+        <w:rPr>
+          <w:rFonts w:ascii="Times New Roman" w:hAnsi="Times New Roman" w:cs="Times New Roman"/>
+          <w:sz w:val="24"/>
+          <w:szCs w:val="24"/>
+          <w:lang w:val="en-US"/>
+        </w:rPr>
+        <w:t>iii</w:t>
+      </w:r>
+      <w:r>
+        <w:rPr>
+          <w:rFonts w:ascii="Times New Roman" w:hAnsi="Times New Roman" w:cs="Times New Roman"/>
+          <w:sz w:val="24"/>
+          <w:szCs w:val="24"/>
+          <w:lang w:val="en-US"/>
+        </w:rPr>
+        <w:t xml:space="preserve">) </w:t>
+      </w:r>
+      <w:r>
+        <w:rPr>
+          <w:rFonts w:ascii="Times New Roman" w:hAnsi="Times New Roman" w:cs="Times New Roman"/>
+          <w:sz w:val="24"/>
+          <w:szCs w:val="24"/>
+          <w:lang w:val="el-GR"/>
+        </w:rPr>
+        <w:t>Για</w:t>
+      </w:r>
+      <w:r>
+        <w:rPr>
+          <w:rFonts w:ascii="Times New Roman" w:hAnsi="Times New Roman" w:cs="Times New Roman"/>
+          <w:sz w:val="24"/>
+          <w:szCs w:val="24"/>
+          <w:lang w:val="en-US"/>
+        </w:rPr>
+        <w:t xml:space="preserve"> </w:t>
+      </w:r>
+      <w:r>
+        <w:rPr>
+          <w:rFonts w:ascii="Times New Roman" w:hAnsi="Times New Roman" w:cs="Times New Roman"/>
+          <w:sz w:val="24"/>
+          <w:szCs w:val="24"/>
+          <w:lang w:val="el-GR"/>
+        </w:rPr>
+        <w:t>λόγους</w:t>
+      </w:r>
+      <w:r>
+        <w:rPr>
+          <w:rFonts w:ascii="Times New Roman" w:hAnsi="Times New Roman" w:cs="Times New Roman"/>
+          <w:sz w:val="24"/>
+          <w:szCs w:val="24"/>
+          <w:lang w:val="en-US"/>
+        </w:rPr>
+        <w:t xml:space="preserve"> </w:t>
+      </w:r>
+      <w:r>
+        <w:rPr>
+          <w:rFonts w:ascii="Times New Roman" w:hAnsi="Times New Roman" w:cs="Times New Roman"/>
+          <w:sz w:val="24"/>
+          <w:szCs w:val="24"/>
+          <w:lang w:val="el-GR"/>
+        </w:rPr>
+        <w:t>ευκρίνειας</w:t>
+      </w:r>
+      <w:r>
+        <w:rPr>
+          <w:rFonts w:ascii="Times New Roman" w:hAnsi="Times New Roman" w:cs="Times New Roman"/>
+          <w:sz w:val="24"/>
+          <w:szCs w:val="24"/>
+          <w:lang w:val="en-US"/>
+        </w:rPr>
+        <w:t xml:space="preserve"> </w:t>
+      </w:r>
+      <w:r>
+        <w:rPr>
+          <w:rFonts w:ascii="Times New Roman" w:hAnsi="Times New Roman" w:cs="Times New Roman"/>
+          <w:sz w:val="24"/>
+          <w:szCs w:val="24"/>
+          <w:lang w:val="el-GR"/>
+        </w:rPr>
+        <w:t>από</w:t>
+      </w:r>
+      <w:r>
+        <w:rPr>
+          <w:rFonts w:ascii="Times New Roman" w:hAnsi="Times New Roman" w:cs="Times New Roman"/>
+          <w:sz w:val="24"/>
+          <w:szCs w:val="24"/>
+          <w:lang w:val="en-US"/>
+        </w:rPr>
+        <w:t xml:space="preserve"> </w:t>
+      </w:r>
+      <w:r>
+        <w:rPr>
+          <w:rFonts w:ascii="Times New Roman" w:hAnsi="Times New Roman" w:cs="Times New Roman"/>
+          <w:sz w:val="24"/>
+          <w:szCs w:val="24"/>
+          <w:lang w:val="el-GR"/>
+        </w:rPr>
+        <w:t>εδώ</w:t>
+      </w:r>
+      <w:r>
+        <w:rPr>
+          <w:rFonts w:ascii="Times New Roman" w:hAnsi="Times New Roman" w:cs="Times New Roman"/>
+          <w:sz w:val="24"/>
+          <w:szCs w:val="24"/>
+          <w:lang w:val="en-US"/>
+        </w:rPr>
+        <w:t xml:space="preserve"> </w:t>
+      </w:r>
+      <w:r>
+        <w:rPr>
+          <w:rFonts w:ascii="Times New Roman" w:hAnsi="Times New Roman" w:cs="Times New Roman"/>
+          <w:sz w:val="24"/>
+          <w:szCs w:val="24"/>
+          <w:lang w:val="el-GR"/>
+        </w:rPr>
+        <w:t>και</w:t>
+      </w:r>
+      <w:r>
+        <w:rPr>
+          <w:rFonts w:ascii="Times New Roman" w:hAnsi="Times New Roman" w:cs="Times New Roman"/>
+          <w:sz w:val="24"/>
+          <w:szCs w:val="24"/>
+          <w:lang w:val="en-US"/>
+        </w:rPr>
+        <w:t xml:space="preserve"> </w:t>
+      </w:r>
+      <w:r>
+        <w:rPr>
+          <w:rFonts w:ascii="Times New Roman" w:hAnsi="Times New Roman" w:cs="Times New Roman"/>
+          <w:sz w:val="24"/>
+          <w:szCs w:val="24"/>
+          <w:lang w:val="el-GR"/>
+        </w:rPr>
+        <w:t>πέρα</w:t>
+      </w:r>
+      <w:r>
+        <w:rPr>
+          <w:rFonts w:ascii="Times New Roman" w:hAnsi="Times New Roman" w:cs="Times New Roman"/>
+          <w:sz w:val="24"/>
+          <w:szCs w:val="24"/>
+          <w:lang w:val="en-US"/>
+        </w:rPr>
+        <w:t xml:space="preserve"> </w:t>
+      </w:r>
+      <w:r>
+        <w:rPr>
+          <w:rFonts w:ascii="Times New Roman" w:hAnsi="Times New Roman" w:cs="Times New Roman"/>
+          <w:sz w:val="24"/>
+          <w:szCs w:val="24"/>
+          <w:lang w:val="el-GR"/>
+        </w:rPr>
+        <w:t>θα</w:t>
+      </w:r>
+      <w:r>
+        <w:rPr>
+          <w:rFonts w:ascii="Times New Roman" w:hAnsi="Times New Roman" w:cs="Times New Roman"/>
+          <w:sz w:val="24"/>
+          <w:szCs w:val="24"/>
+          <w:lang w:val="en-US"/>
+        </w:rPr>
+        <w:t xml:space="preserve"> </w:t>
+      </w:r>
+      <w:r>
+        <w:rPr>
+          <w:rFonts w:ascii="Times New Roman" w:hAnsi="Times New Roman" w:cs="Times New Roman"/>
+          <w:sz w:val="24"/>
+          <w:szCs w:val="24"/>
+          <w:lang w:val="el-GR"/>
+        </w:rPr>
+        <w:t>παρουσιάζω</w:t>
+      </w:r>
+      <w:r>
+        <w:rPr>
+          <w:rFonts w:ascii="Times New Roman" w:hAnsi="Times New Roman" w:cs="Times New Roman"/>
+          <w:sz w:val="24"/>
+          <w:szCs w:val="24"/>
+          <w:lang w:val="en-US"/>
+        </w:rPr>
+        <w:t xml:space="preserve"> </w:t>
+      </w:r>
+      <w:r>
+        <w:rPr>
+          <w:rFonts w:ascii="Times New Roman" w:hAnsi="Times New Roman" w:cs="Times New Roman"/>
+          <w:sz w:val="24"/>
+          <w:szCs w:val="24"/>
+          <w:lang w:val="el-GR"/>
+        </w:rPr>
+        <w:t>μόνο</w:t>
+      </w:r>
+      <w:r>
+        <w:rPr>
+          <w:rFonts w:ascii="Times New Roman" w:hAnsi="Times New Roman" w:cs="Times New Roman"/>
+          <w:sz w:val="24"/>
+          <w:szCs w:val="24"/>
+          <w:lang w:val="en-US"/>
+        </w:rPr>
+        <w:t xml:space="preserve"> </w:t>
+      </w:r>
+      <w:r>
+        <w:rPr>
+          <w:rFonts w:ascii="Times New Roman" w:hAnsi="Times New Roman" w:cs="Times New Roman"/>
+          <w:sz w:val="24"/>
+          <w:szCs w:val="24"/>
+          <w:lang w:val="el-GR"/>
+        </w:rPr>
+        <w:t>τα</w:t>
+      </w:r>
+      <w:r>
+        <w:rPr>
+          <w:rFonts w:ascii="Times New Roman" w:hAnsi="Times New Roman" w:cs="Times New Roman"/>
+          <w:sz w:val="24"/>
+          <w:szCs w:val="24"/>
+          <w:lang w:val="en-US"/>
+        </w:rPr>
+        <w:t xml:space="preserve"> </w:t>
+      </w:r>
+      <w:r>
+        <w:rPr>
+          <w:rFonts w:ascii="Times New Roman" w:hAnsi="Times New Roman" w:cs="Times New Roman"/>
+          <w:sz w:val="24"/>
+          <w:szCs w:val="24"/>
+          <w:lang w:val="en-US"/>
+        </w:rPr>
+        <w:t>MPKI</w:t>
+      </w:r>
+      <w:r>
+        <w:rPr>
+          <w:rFonts w:ascii="Times New Roman" w:hAnsi="Times New Roman" w:cs="Times New Roman"/>
+          <w:sz w:val="24"/>
+          <w:szCs w:val="24"/>
+          <w:lang w:val="en-US"/>
+        </w:rPr>
+        <w:t xml:space="preserve"> </w:t>
+      </w:r>
+      <w:r>
+        <w:rPr>
+          <w:rFonts w:ascii="Times New Roman" w:hAnsi="Times New Roman" w:cs="Times New Roman"/>
+          <w:sz w:val="24"/>
+          <w:szCs w:val="24"/>
+          <w:lang w:val="el-GR"/>
+        </w:rPr>
+        <w:t>για</w:t>
+      </w:r>
+      <w:r>
+        <w:rPr>
+          <w:rFonts w:ascii="Times New Roman" w:hAnsi="Times New Roman" w:cs="Times New Roman"/>
+          <w:sz w:val="24"/>
+          <w:szCs w:val="24"/>
+          <w:lang w:val="en-US"/>
+        </w:rPr>
+        <w:t xml:space="preserve"> </w:t>
+      </w:r>
+      <w:r>
+        <w:rPr>
+          <w:rFonts w:ascii="Times New Roman" w:hAnsi="Times New Roman" w:cs="Times New Roman"/>
+          <w:sz w:val="24"/>
+          <w:szCs w:val="24"/>
+          <w:lang w:val="el-GR"/>
+        </w:rPr>
+        <w:t>τους</w:t>
+      </w:r>
+      <w:r>
+        <w:rPr>
+          <w:rFonts w:ascii="Times New Roman" w:hAnsi="Times New Roman" w:cs="Times New Roman"/>
+          <w:sz w:val="24"/>
+          <w:szCs w:val="24"/>
+          <w:lang w:val="en-US"/>
+        </w:rPr>
+        <w:t xml:space="preserve"> </w:t>
+      </w:r>
+      <w:r>
+        <w:rPr>
+          <w:rFonts w:ascii="Times New Roman" w:hAnsi="Times New Roman" w:cs="Times New Roman"/>
+          <w:sz w:val="24"/>
+          <w:szCs w:val="24"/>
+          <w:lang w:val="en-US"/>
+        </w:rPr>
+        <w:t>predictors</w:t>
+      </w:r>
+      <w:r>
+        <w:rPr>
+          <w:rFonts w:ascii="Times New Roman" w:hAnsi="Times New Roman" w:cs="Times New Roman"/>
+          <w:sz w:val="24"/>
+          <w:szCs w:val="24"/>
+          <w:lang w:val="en-US"/>
+        </w:rPr>
+        <w:t xml:space="preserve"> </w:t>
+      </w:r>
+      <w:r>
+        <w:rPr>
+          <w:rFonts w:ascii="Times New Roman" w:hAnsi="Times New Roman" w:cs="Times New Roman"/>
+          <w:sz w:val="24"/>
+          <w:szCs w:val="24"/>
+          <w:lang w:val="el-GR"/>
+        </w:rPr>
+        <w:t>παρόλα</w:t>
+      </w:r>
+      <w:r>
+        <w:rPr>
+          <w:rFonts w:ascii="Times New Roman" w:hAnsi="Times New Roman" w:cs="Times New Roman"/>
+          <w:sz w:val="24"/>
+          <w:szCs w:val="24"/>
+          <w:lang w:val="en-US"/>
+        </w:rPr>
+        <w:t xml:space="preserve"> </w:t>
+      </w:r>
+      <w:r>
+        <w:rPr>
+          <w:rFonts w:ascii="Times New Roman" w:hAnsi="Times New Roman" w:cs="Times New Roman"/>
+          <w:sz w:val="24"/>
+          <w:szCs w:val="24"/>
+          <w:lang w:val="el-GR"/>
+        </w:rPr>
+        <w:t>αυτά</w:t>
+      </w:r>
+      <w:r>
+        <w:rPr>
+          <w:rFonts w:ascii="Times New Roman" w:hAnsi="Times New Roman" w:cs="Times New Roman"/>
+          <w:sz w:val="24"/>
+          <w:szCs w:val="24"/>
+          <w:lang w:val="en-US"/>
+        </w:rPr>
+        <w:t xml:space="preserve"> </w:t>
+      </w:r>
+      <w:r>
+        <w:rPr>
+          <w:rFonts w:ascii="Times New Roman" w:hAnsi="Times New Roman" w:cs="Times New Roman"/>
+          <w:sz w:val="24"/>
+          <w:szCs w:val="24"/>
+          <w:lang w:val="el-GR"/>
+        </w:rPr>
+        <w:t>στο</w:t>
+      </w:r>
+      <w:r>
+        <w:rPr>
+          <w:rFonts w:ascii="Times New Roman" w:hAnsi="Times New Roman" w:cs="Times New Roman"/>
+          <w:sz w:val="24"/>
+          <w:szCs w:val="24"/>
+          <w:lang w:val="en-US"/>
+        </w:rPr>
+        <w:t xml:space="preserve"> </w:t>
+      </w:r>
+      <w:r>
+        <w:rPr>
+          <w:rFonts w:ascii="Times New Roman" w:hAnsi="Times New Roman" w:cs="Times New Roman"/>
+          <w:sz w:val="24"/>
+          <w:szCs w:val="24"/>
+          <w:lang w:val="en-US"/>
+        </w:rPr>
+        <w:t>repo</w:t>
+      </w:r>
+      <w:r>
+        <w:rPr>
+          <w:rFonts w:ascii="Times New Roman" w:hAnsi="Times New Roman" w:cs="Times New Roman"/>
+          <w:sz w:val="24"/>
+          <w:szCs w:val="24"/>
+          <w:lang w:val="en-US"/>
+        </w:rPr>
+        <w:t xml:space="preserve"> </w:t>
+      </w:r>
+      <w:r>
+        <w:rPr>
+          <w:rFonts w:ascii="Times New Roman" w:hAnsi="Times New Roman" w:cs="Times New Roman"/>
+          <w:sz w:val="24"/>
+          <w:szCs w:val="24"/>
+          <w:lang w:val="el-GR"/>
+        </w:rPr>
+        <w:t>στο</w:t>
+      </w:r>
+      <w:r>
+        <w:rPr>
+          <w:rFonts w:ascii="Times New Roman" w:hAnsi="Times New Roman" w:cs="Times New Roman"/>
+          <w:sz w:val="24"/>
+          <w:szCs w:val="24"/>
+          <w:lang w:val="en-US"/>
+        </w:rPr>
+        <w:t xml:space="preserve"> </w:t>
+      </w:r>
+      <w:r>
+        <w:rPr>
+          <w:rFonts w:ascii="Times New Roman" w:hAnsi="Times New Roman" w:cs="Times New Roman"/>
+          <w:sz w:val="24"/>
+          <w:szCs w:val="24"/>
+          <w:lang w:val="en-US"/>
+        </w:rPr>
+        <w:t>location</w:t>
+      </w:r>
+      <w:r>
+        <w:rPr>
+          <w:rFonts w:ascii="Times New Roman" w:hAnsi="Times New Roman" w:cs="Times New Roman"/>
+          <w:sz w:val="24"/>
+          <w:szCs w:val="24"/>
+          <w:lang w:val="en-US"/>
+        </w:rPr>
+        <w:t xml:space="preserve"> </w:t>
+      </w:r>
+      <w:r>
+        <w:rPr>
+          <w:rFonts w:ascii="Times New Roman" w:hAnsi="Times New Roman" w:cs="Times New Roman"/>
+          <w:sz w:val="24"/>
+          <w:szCs w:val="24"/>
+          <w:lang w:val="en-US"/>
+        </w:rPr>
+        <w:t>advcomparch</w:t>
+      </w:r>
+      <w:r>
+        <w:rPr>
+          <w:rFonts w:ascii="Times New Roman" w:hAnsi="Times New Roman" w:cs="Times New Roman"/>
+          <w:sz w:val="24"/>
+          <w:szCs w:val="24"/>
+          <w:lang w:val="en-US"/>
+        </w:rPr>
+        <w:t>-</w:t>
+      </w:r>
+      <w:r>
+        <w:rPr>
+          <w:rFonts w:ascii="Times New Roman" w:hAnsi="Times New Roman" w:cs="Times New Roman"/>
+          <w:sz w:val="24"/>
+          <w:szCs w:val="24"/>
+          <w:lang w:val="en-US"/>
+        </w:rPr>
+        <w:t>ex</w:t>
+      </w:r>
+      <w:r>
+        <w:rPr>
+          <w:rFonts w:ascii="Times New Roman" w:hAnsi="Times New Roman" w:cs="Times New Roman"/>
+          <w:sz w:val="24"/>
+          <w:szCs w:val="24"/>
+          <w:lang w:val="en-US"/>
+        </w:rPr>
+        <w:t>1-</w:t>
+      </w:r>
+      <w:r>
+        <w:rPr>
+          <w:rFonts w:ascii="Times New Roman" w:hAnsi="Times New Roman" w:cs="Times New Roman"/>
+          <w:sz w:val="24"/>
+          <w:szCs w:val="24"/>
+          <w:lang w:val="en-US"/>
+        </w:rPr>
+        <w:t>helpcode</w:t>
+      </w:r>
+      <w:r>
+        <w:rPr>
+          <w:rFonts w:ascii="Times New Roman" w:hAnsi="Times New Roman" w:cs="Times New Roman"/>
+          <w:sz w:val="24"/>
+          <w:szCs w:val="24"/>
+          <w:lang w:val="en-US"/>
+        </w:rPr>
+        <w:t>/</w:t>
+      </w:r>
+      <w:r>
+        <w:rPr>
+          <w:rFonts w:ascii="Times New Roman" w:hAnsi="Times New Roman" w:cs="Times New Roman"/>
+          <w:sz w:val="24"/>
+          <w:szCs w:val="24"/>
+          <w:lang w:val="en-US"/>
+        </w:rPr>
+        <w:t>csvs</w:t>
+      </w:r>
+      <w:r>
+        <w:rPr>
+          <w:rFonts w:ascii="Times New Roman" w:hAnsi="Times New Roman" w:cs="Times New Roman"/>
+          <w:sz w:val="24"/>
+          <w:szCs w:val="24"/>
+          <w:lang w:val="en-US"/>
+        </w:rPr>
+        <w:t>/32</w:t>
+      </w:r>
+      <w:r>
+        <w:rPr>
+          <w:rFonts w:ascii="Times New Roman" w:hAnsi="Times New Roman" w:cs="Times New Roman"/>
+          <w:sz w:val="24"/>
+          <w:szCs w:val="24"/>
+          <w:lang w:val="en-US"/>
+        </w:rPr>
+        <w:t>K</w:t>
+      </w:r>
+      <w:r>
+        <w:rPr>
+          <w:rFonts w:ascii="Times New Roman" w:hAnsi="Times New Roman" w:cs="Times New Roman"/>
+          <w:sz w:val="24"/>
+          <w:szCs w:val="24"/>
+          <w:lang w:val="en-US"/>
+        </w:rPr>
+        <w:t>_</w:t>
+      </w:r>
+      <w:r>
+        <w:rPr>
+          <w:rFonts w:ascii="Times New Roman" w:hAnsi="Times New Roman" w:cs="Times New Roman"/>
+          <w:sz w:val="24"/>
+          <w:szCs w:val="24"/>
+          <w:lang w:val="en-US"/>
+        </w:rPr>
+        <w:t>predictors</w:t>
+      </w:r>
+      <w:r>
+        <w:rPr>
+          <w:rFonts w:ascii="Times New Roman" w:hAnsi="Times New Roman" w:cs="Times New Roman"/>
+          <w:sz w:val="24"/>
+          <w:szCs w:val="24"/>
+          <w:lang w:val="en-US"/>
+        </w:rPr>
+        <w:t>.</w:t>
+      </w:r>
+      <w:r>
+        <w:rPr>
+          <w:rFonts w:ascii="Times New Roman" w:hAnsi="Times New Roman" w:cs="Times New Roman"/>
+          <w:sz w:val="24"/>
+          <w:szCs w:val="24"/>
+          <w:lang w:val="en-US"/>
+        </w:rPr>
+        <w:t>csv</w:t>
+      </w:r>
+      <w:r>
+        <w:rPr>
+          <w:rFonts w:ascii="Times New Roman" w:hAnsi="Times New Roman" w:cs="Times New Roman"/>
+          <w:sz w:val="24"/>
+          <w:szCs w:val="24"/>
+          <w:lang w:val="en-US"/>
+        </w:rPr>
+        <w:t xml:space="preserve"> </w:t>
+      </w:r>
+      <w:r>
+        <w:rPr>
+          <w:rFonts w:ascii="Times New Roman" w:hAnsi="Times New Roman" w:cs="Times New Roman"/>
+          <w:sz w:val="24"/>
+          <w:szCs w:val="24"/>
+          <w:lang w:val="el-GR"/>
+        </w:rPr>
+        <w:t>υπάρχουν</w:t>
+      </w:r>
+      <w:r>
+        <w:rPr>
+          <w:rFonts w:ascii="Times New Roman" w:hAnsi="Times New Roman" w:cs="Times New Roman"/>
+          <w:sz w:val="24"/>
+          <w:szCs w:val="24"/>
+          <w:lang w:val="en-US"/>
+        </w:rPr>
+        <w:t xml:space="preserve"> </w:t>
+      </w:r>
+      <w:r>
+        <w:rPr>
+          <w:rFonts w:ascii="Times New Roman" w:hAnsi="Times New Roman" w:cs="Times New Roman"/>
+          <w:sz w:val="24"/>
+          <w:szCs w:val="24"/>
+          <w:lang w:val="el-GR"/>
+        </w:rPr>
+        <w:t>και</w:t>
+      </w:r>
+      <w:r>
+        <w:rPr>
+          <w:rFonts w:ascii="Times New Roman" w:hAnsi="Times New Roman" w:cs="Times New Roman"/>
+          <w:sz w:val="24"/>
+          <w:szCs w:val="24"/>
+          <w:lang w:val="en-US"/>
+        </w:rPr>
+        <w:t xml:space="preserve"> </w:t>
+      </w:r>
+      <w:r>
+        <w:rPr>
+          <w:rFonts w:ascii="Times New Roman" w:hAnsi="Times New Roman" w:cs="Times New Roman"/>
+          <w:sz w:val="24"/>
+          <w:szCs w:val="24"/>
+          <w:lang w:val="el-GR"/>
+        </w:rPr>
+        <w:t>τα</w:t>
+      </w:r>
+      <w:r>
+        <w:rPr>
+          <w:rFonts w:ascii="Times New Roman" w:hAnsi="Times New Roman" w:cs="Times New Roman"/>
+          <w:sz w:val="24"/>
+          <w:szCs w:val="24"/>
+          <w:lang w:val="en-US"/>
+        </w:rPr>
+        <w:t xml:space="preserve"> </w:t>
+      </w:r>
+      <w:r>
+        <w:rPr>
+          <w:rFonts w:ascii="Times New Roman" w:hAnsi="Times New Roman" w:cs="Times New Roman"/>
+          <w:sz w:val="24"/>
+          <w:szCs w:val="24"/>
+          <w:lang w:val="el-GR"/>
+        </w:rPr>
+        <w:t>ακριβή</w:t>
+      </w:r>
+      <w:r>
+        <w:rPr>
+          <w:rFonts w:ascii="Times New Roman" w:hAnsi="Times New Roman" w:cs="Times New Roman"/>
+          <w:sz w:val="24"/>
+          <w:szCs w:val="24"/>
+          <w:lang w:val="en-US"/>
+        </w:rPr>
+        <w:t xml:space="preserve"> </w:t>
+      </w:r>
+      <w:r>
+        <w:rPr>
+          <w:rFonts w:ascii="Times New Roman" w:hAnsi="Times New Roman" w:cs="Times New Roman"/>
+          <w:sz w:val="24"/>
+          <w:szCs w:val="24"/>
+          <w:lang w:val="el-GR"/>
+        </w:rPr>
+        <w:t>νούμερα</w:t>
+      </w:r>
+      <w:r>
+        <w:rPr>
+          <w:rFonts w:ascii="Times New Roman" w:hAnsi="Times New Roman" w:cs="Times New Roman"/>
+          <w:sz w:val="24"/>
+          <w:szCs w:val="24"/>
+          <w:lang w:val="en-US"/>
+        </w:rPr>
+        <w:t xml:space="preserve"> </w:t>
+      </w:r>
+      <w:r>
+        <w:rPr>
+          <w:rFonts w:ascii="Times New Roman" w:hAnsi="Times New Roman" w:cs="Times New Roman"/>
+          <w:sz w:val="24"/>
+          <w:szCs w:val="24"/>
+          <w:lang w:val="el-GR"/>
+        </w:rPr>
+        <w:t>για</w:t>
+      </w:r>
+      <w:r>
+        <w:rPr>
+          <w:rFonts w:ascii="Times New Roman" w:hAnsi="Times New Roman" w:cs="Times New Roman"/>
+          <w:sz w:val="24"/>
+          <w:szCs w:val="24"/>
+          <w:lang w:val="en-US"/>
+        </w:rPr>
+        <w:t xml:space="preserve"> </w:t>
+      </w:r>
+      <w:r>
+        <w:rPr>
+          <w:rFonts w:ascii="Times New Roman" w:hAnsi="Times New Roman" w:cs="Times New Roman"/>
+          <w:sz w:val="24"/>
+          <w:szCs w:val="24"/>
+          <w:lang w:val="el-GR"/>
+        </w:rPr>
+        <w:t>τα</w:t>
+      </w:r>
+      <w:r>
+        <w:rPr>
+          <w:rFonts w:ascii="Times New Roman" w:hAnsi="Times New Roman" w:cs="Times New Roman"/>
+          <w:sz w:val="24"/>
+          <w:szCs w:val="24"/>
+          <w:lang w:val="en-US"/>
+        </w:rPr>
+        <w:t xml:space="preserve"> correct</w:t>
+      </w:r>
+      <w:r>
+        <w:rPr>
+          <w:rFonts w:ascii="Times New Roman" w:hAnsi="Times New Roman" w:cs="Times New Roman"/>
+          <w:sz w:val="24"/>
+          <w:szCs w:val="24"/>
+          <w:lang w:val="en-US"/>
+        </w:rPr>
+        <w:t xml:space="preserve"> </w:t>
+      </w:r>
+      <w:r>
+        <w:rPr>
+          <w:rFonts w:ascii="Times New Roman" w:hAnsi="Times New Roman" w:cs="Times New Roman"/>
+          <w:sz w:val="24"/>
+          <w:szCs w:val="24"/>
+          <w:lang w:val="el-GR"/>
+        </w:rPr>
+        <w:t>και</w:t>
+      </w:r>
+      <w:r>
+        <w:rPr>
+          <w:rFonts w:ascii="Times New Roman" w:hAnsi="Times New Roman" w:cs="Times New Roman"/>
+          <w:sz w:val="24"/>
+          <w:szCs w:val="24"/>
+          <w:lang w:val="en-US"/>
+        </w:rPr>
+        <w:t xml:space="preserve"> </w:t>
+      </w:r>
+      <w:r>
+        <w:rPr>
+          <w:rFonts w:ascii="Times New Roman" w:hAnsi="Times New Roman" w:cs="Times New Roman"/>
+          <w:sz w:val="24"/>
+          <w:szCs w:val="24"/>
+          <w:lang w:val="en-US"/>
+        </w:rPr>
+        <w:t>incorrect predictions.</w:t>
+      </w:r>
+    </w:p>
+    <w:tbl>
+      <w:tblPr>
+        <w:tblStyle w:val="TableGrid"/>
+        <w:tblW w:w="9985" w:type="dxa"/>
+        <w:jc w:val="center"/>
+        <w:tblLook w:val="04A0" w:firstRow="1" w:lastRow="0" w:firstColumn="1" w:lastColumn="0" w:noHBand="0" w:noVBand="1"/>
+      </w:tblPr>
+      <w:tblGrid>
+        <w:gridCol w:w="1608"/>
+        <w:gridCol w:w="1054"/>
+        <w:gridCol w:w="1389"/>
+        <w:gridCol w:w="1166"/>
+        <w:gridCol w:w="1166"/>
+        <w:gridCol w:w="1166"/>
+        <w:gridCol w:w="1166"/>
+        <w:gridCol w:w="1270"/>
+      </w:tblGrid>
+      <w:tr>
+        <w:trPr>
+          <w:jc w:val="center"/>
+        </w:trPr>
+        <w:tc>
+          <w:tcPr>
+            <w:tcW w:w="1608" w:type="dxa"/>
+            <w:shd w:val="clear" w:color="auto" w:fill="83CAEB" w:themeFill="accent1" w:themeFillTint="66"/>
+            <w:vAlign w:val="bottom"/>
+          </w:tcPr>
+          <w:p>
+            <w:pPr>
+              <w:rPr>
+                <w:rFonts w:ascii="Times New Roman" w:hAnsi="Times New Roman" w:cs="Times New Roman"/>
+                <w:sz w:val="24"/>
+                <w:szCs w:val="24"/>
+                <w:lang w:val="en-US"/>
+              </w:rPr>
+            </w:pPr>
+            <w:r>
+              <w:rPr>
+                <w:rFonts w:ascii="Aptos Narrow" w:hAnsi="Aptos Narrow"/>
+                <w:color w:val="000000"/>
+              </w:rPr>
+              <w:t>Benchmark</w:t>
+            </w:r>
+          </w:p>
+        </w:tc>
+        <w:tc>
+          <w:tcPr>
+            <w:tcW w:w="1054" w:type="dxa"/>
+            <w:vAlign w:val="bottom"/>
+          </w:tcPr>
+          <w:p>
+            <w:pPr>
+              <w:rPr>
+                <w:rFonts w:ascii="Times New Roman" w:hAnsi="Times New Roman" w:cs="Times New Roman"/>
+                <w:sz w:val="24"/>
+                <w:szCs w:val="24"/>
+                <w:lang w:val="en-US"/>
+              </w:rPr>
+            </w:pPr>
+            <w:r>
+              <w:rPr>
+                <w:rFonts w:ascii="Aptos Narrow" w:hAnsi="Aptos Narrow"/>
+                <w:color w:val="000000"/>
+              </w:rPr>
+              <w:t>MPKI 1 bit</w:t>
+            </w:r>
+          </w:p>
+        </w:tc>
+        <w:tc>
+          <w:tcPr>
+            <w:tcW w:w="1389" w:type="dxa"/>
+            <w:vAlign w:val="bottom"/>
+          </w:tcPr>
+          <w:p>
+            <w:pPr>
+              <w:spacing w:line="240" w:lineRule="auto"/>
+              <w:rPr>
+                <w:rFonts w:ascii="Aptos Narrow" w:hAnsi="Aptos Narrow"/>
+                <w:color w:val="000000"/>
+                <w:lang w:val="en-US"/>
+              </w:rPr>
+            </w:pPr>
+            <w:r>
+              <w:rPr>
+                <w:rFonts w:ascii="Aptos Narrow" w:hAnsi="Aptos Narrow"/>
+                <w:color w:val="000000"/>
+              </w:rPr>
+              <w:t>MPKI FSM 1</w:t>
+            </w:r>
+          </w:p>
+          <w:p>
+            <w:pPr>
+              <w:rPr>
+                <w:rFonts w:ascii="Times New Roman" w:hAnsi="Times New Roman" w:cs="Times New Roman"/>
+                <w:sz w:val="24"/>
+                <w:szCs w:val="24"/>
+                <w:lang w:val="en-US"/>
+              </w:rPr>
+            </w:pPr>
+          </w:p>
+        </w:tc>
+        <w:tc>
+          <w:tcPr>
+            <w:tcW w:w="1166" w:type="dxa"/>
+            <w:vAlign w:val="bottom"/>
+          </w:tcPr>
+          <w:p>
+            <w:pPr>
+              <w:rPr>
+                <w:rFonts w:ascii="Times New Roman" w:hAnsi="Times New Roman" w:cs="Times New Roman"/>
+                <w:sz w:val="24"/>
+                <w:szCs w:val="24"/>
+                <w:lang w:val="en-US"/>
+              </w:rPr>
+            </w:pPr>
+            <w:r>
+              <w:rPr>
+                <w:rFonts w:ascii="Aptos Narrow" w:hAnsi="Aptos Narrow"/>
+                <w:color w:val="000000"/>
+              </w:rPr>
+              <w:t>MKPI FSM 2</w:t>
+            </w:r>
+          </w:p>
+        </w:tc>
+        <w:tc>
+          <w:tcPr>
+            <w:tcW w:w="1166" w:type="dxa"/>
+            <w:vAlign w:val="bottom"/>
+          </w:tcPr>
+          <w:p>
+            <w:pPr>
+              <w:rPr>
+                <w:rFonts w:ascii="Times New Roman" w:hAnsi="Times New Roman" w:cs="Times New Roman"/>
+                <w:sz w:val="24"/>
+                <w:szCs w:val="24"/>
+                <w:lang w:val="en-US"/>
+              </w:rPr>
+            </w:pPr>
+            <w:r>
+              <w:rPr>
+                <w:rFonts w:ascii="Aptos Narrow" w:hAnsi="Aptos Narrow"/>
+                <w:color w:val="000000"/>
+              </w:rPr>
+              <w:t>MKPI FSM 3</w:t>
+            </w:r>
+          </w:p>
+        </w:tc>
+        <w:tc>
+          <w:tcPr>
+            <w:tcW w:w="1166" w:type="dxa"/>
+            <w:vAlign w:val="bottom"/>
+          </w:tcPr>
+          <w:p>
+            <w:pPr>
+              <w:rPr>
+                <w:rFonts w:ascii="Times New Roman" w:hAnsi="Times New Roman" w:cs="Times New Roman"/>
+                <w:sz w:val="24"/>
+                <w:szCs w:val="24"/>
+                <w:lang w:val="en-US"/>
+              </w:rPr>
+            </w:pPr>
+            <w:r>
+              <w:rPr>
+                <w:rFonts w:ascii="Aptos Narrow" w:hAnsi="Aptos Narrow"/>
+                <w:color w:val="000000"/>
+              </w:rPr>
+              <w:t>MKPI FSM 4</w:t>
+            </w:r>
+          </w:p>
+        </w:tc>
+        <w:tc>
+          <w:tcPr>
+            <w:tcW w:w="1166" w:type="dxa"/>
+            <w:vAlign w:val="bottom"/>
+          </w:tcPr>
+          <w:p>
+            <w:pPr>
+              <w:rPr>
+                <w:rFonts w:ascii="Times New Roman" w:hAnsi="Times New Roman" w:cs="Times New Roman"/>
+                <w:sz w:val="24"/>
+                <w:szCs w:val="24"/>
+                <w:lang w:val="en-US"/>
+              </w:rPr>
+            </w:pPr>
+            <w:r>
+              <w:rPr>
+                <w:rFonts w:ascii="Aptos Narrow" w:hAnsi="Aptos Narrow"/>
+                <w:color w:val="000000"/>
+              </w:rPr>
+              <w:t>MKPI FSM 5</w:t>
+            </w:r>
+          </w:p>
+        </w:tc>
+        <w:tc>
+          <w:tcPr>
+            <w:tcW w:w="1270" w:type="dxa"/>
+            <w:vAlign w:val="bottom"/>
+          </w:tcPr>
+          <w:p>
+            <w:pPr>
+              <w:rPr>
+                <w:rFonts w:ascii="Times New Roman" w:hAnsi="Times New Roman" w:cs="Times New Roman"/>
+                <w:sz w:val="24"/>
+                <w:szCs w:val="24"/>
+                <w:lang w:val="en-US"/>
+              </w:rPr>
+            </w:pPr>
+            <w:r>
+              <w:rPr>
+                <w:rFonts w:ascii="Aptos Narrow" w:hAnsi="Aptos Narrow"/>
+                <w:color w:val="000000"/>
+              </w:rPr>
+              <w:t xml:space="preserve">MPKI </w:t>
+            </w:r>
+            <w:r>
+              <w:rPr>
+                <w:rFonts w:ascii="Aptos Narrow" w:hAnsi="Aptos Narrow"/>
+                <w:color w:val="000000"/>
+                <w:lang w:val="el-GR"/>
+              </w:rPr>
+              <w:t>4</w:t>
+            </w:r>
+            <w:r>
+              <w:rPr>
+                <w:rFonts w:ascii="Aptos Narrow" w:hAnsi="Aptos Narrow"/>
+                <w:color w:val="000000"/>
+              </w:rPr>
+              <w:t xml:space="preserve"> bit</w:t>
+            </w:r>
+          </w:p>
+        </w:tc>
+      </w:tr>
+      <w:tr>
+        <w:trPr>
+          <w:jc w:val="center"/>
+        </w:trPr>
+        <w:tc>
+          <w:tcPr>
+            <w:tcW w:w="1608" w:type="dxa"/>
+            <w:shd w:val="clear" w:color="auto" w:fill="83CAEB" w:themeFill="accent1" w:themeFillTint="66"/>
+            <w:vAlign w:val="bottom"/>
+          </w:tcPr>
+          <w:p>
+            <w:pPr>
+              <w:rPr>
+                <w:rFonts w:ascii="Times New Roman" w:hAnsi="Times New Roman" w:cs="Times New Roman"/>
+                <w:sz w:val="24"/>
+                <w:szCs w:val="24"/>
+                <w:lang w:val="en-US"/>
+              </w:rPr>
+            </w:pPr>
+            <w:r>
+              <w:rPr>
+                <w:rFonts w:ascii="Aptos Narrow" w:hAnsi="Aptos Narrow"/>
+                <w:color w:val="000000"/>
+              </w:rPr>
+              <w:t>403.gcc</w:t>
+            </w:r>
+          </w:p>
+        </w:tc>
+        <w:tc>
+          <w:tcPr>
+            <w:tcW w:w="1054" w:type="dxa"/>
+            <w:vAlign w:val="bottom"/>
+          </w:tcPr>
+          <w:p>
+            <w:pPr>
+              <w:rPr>
+                <w:rFonts w:ascii="Times New Roman" w:hAnsi="Times New Roman" w:cs="Times New Roman"/>
+                <w:sz w:val="24"/>
+                <w:szCs w:val="24"/>
+                <w:lang w:val="en-US"/>
+              </w:rPr>
+            </w:pPr>
+            <w:r>
+              <w:rPr>
+                <w:rFonts w:ascii="Aptos Narrow" w:hAnsi="Aptos Narrow"/>
+                <w:color w:val="000000"/>
+              </w:rPr>
+              <w:t>22.31711</w:t>
+            </w:r>
+          </w:p>
+        </w:tc>
+        <w:tc>
+          <w:tcPr>
+            <w:tcW w:w="1389" w:type="dxa"/>
+            <w:vAlign w:val="bottom"/>
+          </w:tcPr>
+          <w:p>
+            <w:pPr>
+              <w:rPr>
+                <w:rFonts w:ascii="Times New Roman" w:hAnsi="Times New Roman" w:cs="Times New Roman"/>
+                <w:sz w:val="24"/>
+                <w:szCs w:val="24"/>
+                <w:lang w:val="en-US"/>
+              </w:rPr>
+            </w:pPr>
+            <w:r>
+              <w:rPr>
+                <w:rFonts w:ascii="Aptos Narrow" w:hAnsi="Aptos Narrow"/>
+                <w:color w:val="000000"/>
+              </w:rPr>
+              <w:t>17.06008156</w:t>
+            </w:r>
+          </w:p>
+        </w:tc>
+        <w:tc>
+          <w:tcPr>
+            <w:tcW w:w="1166" w:type="dxa"/>
+            <w:vAlign w:val="bottom"/>
+          </w:tcPr>
+          <w:p>
+            <w:pPr>
+              <w:rPr>
+                <w:rFonts w:ascii="Times New Roman" w:hAnsi="Times New Roman" w:cs="Times New Roman"/>
+                <w:sz w:val="24"/>
+                <w:szCs w:val="24"/>
+                <w:lang w:val="en-US"/>
+              </w:rPr>
+            </w:pPr>
+            <w:r>
+              <w:rPr>
+                <w:rFonts w:ascii="Aptos Narrow" w:hAnsi="Aptos Narrow"/>
+                <w:color w:val="000000"/>
+              </w:rPr>
+              <w:t>17.268342</w:t>
+            </w:r>
+          </w:p>
+        </w:tc>
+        <w:tc>
+          <w:tcPr>
+            <w:tcW w:w="1166" w:type="dxa"/>
+            <w:vAlign w:val="bottom"/>
+          </w:tcPr>
+          <w:p>
+            <w:pPr>
+              <w:rPr>
+                <w:rFonts w:ascii="Times New Roman" w:hAnsi="Times New Roman" w:cs="Times New Roman"/>
+                <w:sz w:val="24"/>
+                <w:szCs w:val="24"/>
+                <w:lang w:val="en-US"/>
+              </w:rPr>
+            </w:pPr>
+            <w:r>
+              <w:rPr>
+                <w:rFonts w:ascii="Aptos Narrow" w:hAnsi="Aptos Narrow"/>
+                <w:color w:val="000000"/>
+              </w:rPr>
+              <w:t>17.159862</w:t>
+            </w:r>
+          </w:p>
+        </w:tc>
+        <w:tc>
+          <w:tcPr>
+            <w:tcW w:w="1166" w:type="dxa"/>
+            <w:vAlign w:val="bottom"/>
+          </w:tcPr>
+          <w:p>
+            <w:pPr>
+              <w:rPr>
+                <w:rFonts w:ascii="Times New Roman" w:hAnsi="Times New Roman" w:cs="Times New Roman"/>
+                <w:sz w:val="24"/>
+                <w:szCs w:val="24"/>
+                <w:lang w:val="en-US"/>
+              </w:rPr>
+            </w:pPr>
+            <w:r>
+              <w:rPr>
+                <w:rFonts w:ascii="Aptos Narrow" w:hAnsi="Aptos Narrow"/>
+                <w:color w:val="000000"/>
+              </w:rPr>
+              <w:t>17.31789</w:t>
+            </w:r>
+          </w:p>
+        </w:tc>
+        <w:tc>
+          <w:tcPr>
+            <w:tcW w:w="1166" w:type="dxa"/>
+            <w:vAlign w:val="bottom"/>
+          </w:tcPr>
+          <w:p>
+            <w:pPr>
+              <w:rPr>
+                <w:rFonts w:ascii="Times New Roman" w:hAnsi="Times New Roman" w:cs="Times New Roman"/>
+                <w:sz w:val="24"/>
+                <w:szCs w:val="24"/>
+                <w:lang w:val="en-US"/>
+              </w:rPr>
+            </w:pPr>
+            <w:r>
+              <w:rPr>
+                <w:rFonts w:ascii="Aptos Narrow" w:hAnsi="Aptos Narrow"/>
+                <w:color w:val="000000"/>
+              </w:rPr>
+              <w:t>18.151188</w:t>
+            </w:r>
+          </w:p>
+        </w:tc>
+        <w:tc>
+          <w:tcPr>
+            <w:tcW w:w="1270" w:type="dxa"/>
+            <w:vAlign w:val="bottom"/>
+          </w:tcPr>
+          <w:p>
+            <w:pPr>
+              <w:rPr>
+                <w:rFonts w:ascii="Times New Roman" w:hAnsi="Times New Roman" w:cs="Times New Roman"/>
+                <w:sz w:val="24"/>
+                <w:szCs w:val="24"/>
+                <w:lang w:val="en-US"/>
+              </w:rPr>
+            </w:pPr>
+            <w:r>
+              <w:rPr>
+                <w:rFonts w:ascii="Aptos Narrow" w:hAnsi="Aptos Narrow"/>
+                <w:color w:val="000000"/>
+              </w:rPr>
+              <w:t>16.57297</w:t>
+            </w:r>
+          </w:p>
+        </w:tc>
+      </w:tr>
+      <w:tr>
+        <w:trPr>
+          <w:jc w:val="center"/>
+        </w:trPr>
+        <w:tc>
+          <w:tcPr>
+            <w:tcW w:w="1608" w:type="dxa"/>
+            <w:shd w:val="clear" w:color="auto" w:fill="83CAEB" w:themeFill="accent1" w:themeFillTint="66"/>
+            <w:vAlign w:val="bottom"/>
+          </w:tcPr>
+          <w:p>
+            <w:pPr>
+              <w:rPr>
+                <w:rFonts w:ascii="Times New Roman" w:hAnsi="Times New Roman" w:cs="Times New Roman"/>
+                <w:sz w:val="24"/>
+                <w:szCs w:val="24"/>
+                <w:lang w:val="en-US"/>
+              </w:rPr>
+            </w:pPr>
+            <w:r>
+              <w:rPr>
+                <w:rFonts w:ascii="Aptos Narrow" w:hAnsi="Aptos Narrow"/>
+                <w:color w:val="000000"/>
+              </w:rPr>
+              <w:t>410.bwaves</w:t>
+            </w:r>
+          </w:p>
+        </w:tc>
+        <w:tc>
+          <w:tcPr>
+            <w:tcW w:w="1054" w:type="dxa"/>
+            <w:vAlign w:val="bottom"/>
+          </w:tcPr>
+          <w:p>
+            <w:pPr>
+              <w:rPr>
+                <w:rFonts w:ascii="Times New Roman" w:hAnsi="Times New Roman" w:cs="Times New Roman"/>
+                <w:sz w:val="24"/>
+                <w:szCs w:val="24"/>
+                <w:lang w:val="en-US"/>
+              </w:rPr>
+            </w:pPr>
+            <w:r>
+              <w:rPr>
+                <w:rFonts w:ascii="Aptos Narrow" w:hAnsi="Aptos Narrow"/>
+                <w:color w:val="000000"/>
+              </w:rPr>
+              <w:t>24.88336</w:t>
+            </w:r>
+          </w:p>
+        </w:tc>
+        <w:tc>
+          <w:tcPr>
+            <w:tcW w:w="1389" w:type="dxa"/>
+            <w:vAlign w:val="bottom"/>
+          </w:tcPr>
+          <w:p>
+            <w:pPr>
+              <w:rPr>
+                <w:rFonts w:ascii="Times New Roman" w:hAnsi="Times New Roman" w:cs="Times New Roman"/>
+                <w:sz w:val="24"/>
+                <w:szCs w:val="24"/>
+                <w:lang w:val="en-US"/>
+              </w:rPr>
+            </w:pPr>
+            <w:r>
+              <w:rPr>
+                <w:rFonts w:ascii="Aptos Narrow" w:hAnsi="Aptos Narrow"/>
+                <w:color w:val="000000"/>
+              </w:rPr>
+              <w:t>13.74602516</w:t>
+            </w:r>
+          </w:p>
+        </w:tc>
+        <w:tc>
+          <w:tcPr>
+            <w:tcW w:w="1166" w:type="dxa"/>
+            <w:vAlign w:val="bottom"/>
+          </w:tcPr>
+          <w:p>
+            <w:pPr>
+              <w:rPr>
+                <w:rFonts w:ascii="Times New Roman" w:hAnsi="Times New Roman" w:cs="Times New Roman"/>
+                <w:sz w:val="24"/>
+                <w:szCs w:val="24"/>
+                <w:lang w:val="en-US"/>
+              </w:rPr>
+            </w:pPr>
+            <w:r>
+              <w:rPr>
+                <w:rFonts w:ascii="Aptos Narrow" w:hAnsi="Aptos Narrow"/>
+                <w:color w:val="000000"/>
+              </w:rPr>
+              <w:t>14.436847</w:t>
+            </w:r>
+          </w:p>
+        </w:tc>
+        <w:tc>
+          <w:tcPr>
+            <w:tcW w:w="1166" w:type="dxa"/>
+            <w:vAlign w:val="bottom"/>
+          </w:tcPr>
+          <w:p>
+            <w:pPr>
+              <w:rPr>
+                <w:rFonts w:ascii="Times New Roman" w:hAnsi="Times New Roman" w:cs="Times New Roman"/>
+                <w:sz w:val="24"/>
+                <w:szCs w:val="24"/>
+                <w:lang w:val="en-US"/>
+              </w:rPr>
+            </w:pPr>
+            <w:r>
+              <w:rPr>
+                <w:rFonts w:ascii="Aptos Narrow" w:hAnsi="Aptos Narrow"/>
+                <w:color w:val="000000"/>
+              </w:rPr>
+              <w:t>13.762659</w:t>
+            </w:r>
+          </w:p>
+        </w:tc>
+        <w:tc>
+          <w:tcPr>
+            <w:tcW w:w="1166" w:type="dxa"/>
+            <w:vAlign w:val="bottom"/>
+          </w:tcPr>
+          <w:p>
+            <w:pPr>
+              <w:rPr>
+                <w:rFonts w:ascii="Times New Roman" w:hAnsi="Times New Roman" w:cs="Times New Roman"/>
+                <w:sz w:val="24"/>
+                <w:szCs w:val="24"/>
+                <w:lang w:val="en-US"/>
+              </w:rPr>
+            </w:pPr>
+            <w:r>
+              <w:rPr>
+                <w:rFonts w:ascii="Aptos Narrow" w:hAnsi="Aptos Narrow"/>
+                <w:color w:val="000000"/>
+              </w:rPr>
+              <w:t>13.837085</w:t>
+            </w:r>
+          </w:p>
+        </w:tc>
+        <w:tc>
+          <w:tcPr>
+            <w:tcW w:w="1166" w:type="dxa"/>
+            <w:vAlign w:val="bottom"/>
+          </w:tcPr>
+          <w:p>
+            <w:pPr>
+              <w:rPr>
+                <w:rFonts w:ascii="Times New Roman" w:hAnsi="Times New Roman" w:cs="Times New Roman"/>
+                <w:sz w:val="24"/>
+                <w:szCs w:val="24"/>
+                <w:lang w:val="en-US"/>
+              </w:rPr>
+            </w:pPr>
+            <w:r>
+              <w:rPr>
+                <w:rFonts w:ascii="Aptos Narrow" w:hAnsi="Aptos Narrow"/>
+                <w:color w:val="000000"/>
+              </w:rPr>
+              <w:t>19.606763</w:t>
+            </w:r>
+          </w:p>
+        </w:tc>
+        <w:tc>
+          <w:tcPr>
+            <w:tcW w:w="1270" w:type="dxa"/>
+            <w:vAlign w:val="bottom"/>
+          </w:tcPr>
+          <w:p>
+            <w:pPr>
+              <w:rPr>
+                <w:rFonts w:ascii="Times New Roman" w:hAnsi="Times New Roman" w:cs="Times New Roman"/>
+                <w:sz w:val="24"/>
+                <w:szCs w:val="24"/>
+                <w:lang w:val="en-US"/>
+              </w:rPr>
+            </w:pPr>
+            <w:r>
+              <w:rPr>
+                <w:rFonts w:ascii="Aptos Narrow" w:hAnsi="Aptos Narrow"/>
+                <w:color w:val="000000"/>
+              </w:rPr>
+              <w:t>13.59671</w:t>
+            </w:r>
+          </w:p>
+        </w:tc>
+      </w:tr>
+      <w:tr>
+        <w:trPr>
+          <w:jc w:val="center"/>
+        </w:trPr>
+        <w:tc>
+          <w:tcPr>
+            <w:tcW w:w="1608" w:type="dxa"/>
+            <w:shd w:val="clear" w:color="auto" w:fill="83CAEB" w:themeFill="accent1" w:themeFillTint="66"/>
+            <w:vAlign w:val="bottom"/>
+          </w:tcPr>
+          <w:p>
+            <w:pPr>
+              <w:rPr>
+                <w:rFonts w:ascii="Times New Roman" w:hAnsi="Times New Roman" w:cs="Times New Roman"/>
+                <w:sz w:val="24"/>
+                <w:szCs w:val="24"/>
+                <w:lang w:val="en-US"/>
+              </w:rPr>
+            </w:pPr>
+            <w:r>
+              <w:rPr>
+                <w:rFonts w:ascii="Aptos Narrow" w:hAnsi="Aptos Narrow"/>
+                <w:color w:val="000000"/>
+              </w:rPr>
+              <w:t>416.gamess</w:t>
+            </w:r>
+          </w:p>
+        </w:tc>
+        <w:tc>
+          <w:tcPr>
+            <w:tcW w:w="1054" w:type="dxa"/>
+            <w:vAlign w:val="bottom"/>
+          </w:tcPr>
+          <w:p>
+            <w:pPr>
+              <w:rPr>
+                <w:rFonts w:ascii="Times New Roman" w:hAnsi="Times New Roman" w:cs="Times New Roman"/>
+                <w:sz w:val="24"/>
+                <w:szCs w:val="24"/>
+                <w:lang w:val="en-US"/>
+              </w:rPr>
+            </w:pPr>
+            <w:r>
+              <w:rPr>
+                <w:rFonts w:ascii="Aptos Narrow" w:hAnsi="Aptos Narrow"/>
+                <w:color w:val="000000"/>
+              </w:rPr>
+              <w:t>8.180192</w:t>
+            </w:r>
+          </w:p>
+        </w:tc>
+        <w:tc>
+          <w:tcPr>
+            <w:tcW w:w="1389" w:type="dxa"/>
+            <w:vAlign w:val="bottom"/>
+          </w:tcPr>
+          <w:p>
+            <w:pPr>
+              <w:rPr>
+                <w:rFonts w:ascii="Times New Roman" w:hAnsi="Times New Roman" w:cs="Times New Roman"/>
+                <w:sz w:val="24"/>
+                <w:szCs w:val="24"/>
+                <w:lang w:val="en-US"/>
+              </w:rPr>
+            </w:pPr>
+            <w:r>
+              <w:rPr>
+                <w:rFonts w:ascii="Aptos Narrow" w:hAnsi="Aptos Narrow"/>
+                <w:color w:val="000000"/>
+              </w:rPr>
+              <w:t>4.810376222</w:t>
+            </w:r>
+          </w:p>
+        </w:tc>
+        <w:tc>
+          <w:tcPr>
+            <w:tcW w:w="1166" w:type="dxa"/>
+            <w:vAlign w:val="bottom"/>
+          </w:tcPr>
+          <w:p>
+            <w:pPr>
+              <w:rPr>
+                <w:rFonts w:ascii="Times New Roman" w:hAnsi="Times New Roman" w:cs="Times New Roman"/>
+                <w:sz w:val="24"/>
+                <w:szCs w:val="24"/>
+                <w:lang w:val="en-US"/>
+              </w:rPr>
+            </w:pPr>
+            <w:r>
+              <w:rPr>
+                <w:rFonts w:ascii="Aptos Narrow" w:hAnsi="Aptos Narrow"/>
+                <w:color w:val="000000"/>
+              </w:rPr>
+              <w:t>5.8846341</w:t>
+            </w:r>
+          </w:p>
+        </w:tc>
+        <w:tc>
+          <w:tcPr>
+            <w:tcW w:w="1166" w:type="dxa"/>
+            <w:vAlign w:val="bottom"/>
+          </w:tcPr>
+          <w:p>
+            <w:pPr>
+              <w:rPr>
+                <w:rFonts w:ascii="Times New Roman" w:hAnsi="Times New Roman" w:cs="Times New Roman"/>
+                <w:sz w:val="24"/>
+                <w:szCs w:val="24"/>
+                <w:lang w:val="en-US"/>
+              </w:rPr>
+            </w:pPr>
+            <w:r>
+              <w:rPr>
+                <w:rFonts w:ascii="Aptos Narrow" w:hAnsi="Aptos Narrow"/>
+                <w:color w:val="000000"/>
+              </w:rPr>
+              <w:t>5.1134805</w:t>
+            </w:r>
+          </w:p>
+        </w:tc>
+        <w:tc>
+          <w:tcPr>
+            <w:tcW w:w="1166" w:type="dxa"/>
+            <w:vAlign w:val="bottom"/>
+          </w:tcPr>
+          <w:p>
+            <w:pPr>
+              <w:rPr>
+                <w:rFonts w:ascii="Times New Roman" w:hAnsi="Times New Roman" w:cs="Times New Roman"/>
+                <w:sz w:val="24"/>
+                <w:szCs w:val="24"/>
+                <w:lang w:val="en-US"/>
+              </w:rPr>
+            </w:pPr>
+            <w:r>
+              <w:rPr>
+                <w:rFonts w:ascii="Aptos Narrow" w:hAnsi="Aptos Narrow"/>
+                <w:color w:val="000000"/>
+              </w:rPr>
+              <w:t>4.8491437</w:t>
+            </w:r>
+          </w:p>
+        </w:tc>
+        <w:tc>
+          <w:tcPr>
+            <w:tcW w:w="1166" w:type="dxa"/>
+            <w:vAlign w:val="bottom"/>
+          </w:tcPr>
+          <w:p>
+            <w:pPr>
+              <w:rPr>
+                <w:rFonts w:ascii="Times New Roman" w:hAnsi="Times New Roman" w:cs="Times New Roman"/>
+                <w:sz w:val="24"/>
+                <w:szCs w:val="24"/>
+                <w:lang w:val="en-US"/>
+              </w:rPr>
+            </w:pPr>
+            <w:r>
+              <w:rPr>
+                <w:rFonts w:ascii="Aptos Narrow" w:hAnsi="Aptos Narrow"/>
+                <w:color w:val="000000"/>
+              </w:rPr>
+              <w:t>6.0486909</w:t>
+            </w:r>
+          </w:p>
+        </w:tc>
+        <w:tc>
+          <w:tcPr>
+            <w:tcW w:w="1270" w:type="dxa"/>
+            <w:vAlign w:val="bottom"/>
+          </w:tcPr>
+          <w:p>
+            <w:pPr>
+              <w:rPr>
+                <w:rFonts w:ascii="Times New Roman" w:hAnsi="Times New Roman" w:cs="Times New Roman"/>
+                <w:sz w:val="24"/>
+                <w:szCs w:val="24"/>
+                <w:lang w:val="en-US"/>
+              </w:rPr>
+            </w:pPr>
+            <w:r>
+              <w:rPr>
+                <w:rFonts w:ascii="Aptos Narrow" w:hAnsi="Aptos Narrow"/>
+                <w:color w:val="000000"/>
+              </w:rPr>
+              <w:t>5.371111</w:t>
+            </w:r>
+          </w:p>
+        </w:tc>
+      </w:tr>
+      <w:tr>
+        <w:trPr>
+          <w:jc w:val="center"/>
+        </w:trPr>
+        <w:tc>
+          <w:tcPr>
+            <w:tcW w:w="1608" w:type="dxa"/>
+            <w:shd w:val="clear" w:color="auto" w:fill="83CAEB" w:themeFill="accent1" w:themeFillTint="66"/>
+            <w:vAlign w:val="bottom"/>
+          </w:tcPr>
+          <w:p>
+            <w:pPr>
+              <w:rPr>
+                <w:rFonts w:ascii="Times New Roman" w:hAnsi="Times New Roman" w:cs="Times New Roman"/>
+                <w:sz w:val="24"/>
+                <w:szCs w:val="24"/>
+                <w:lang w:val="en-US"/>
+              </w:rPr>
+            </w:pPr>
+            <w:r>
+              <w:rPr>
+                <w:rFonts w:ascii="Aptos Narrow" w:hAnsi="Aptos Narrow"/>
+                <w:color w:val="000000"/>
+              </w:rPr>
+              <w:t>429.mcf</w:t>
+            </w:r>
+          </w:p>
+        </w:tc>
+        <w:tc>
+          <w:tcPr>
+            <w:tcW w:w="1054" w:type="dxa"/>
+            <w:vAlign w:val="bottom"/>
+          </w:tcPr>
+          <w:p>
+            <w:pPr>
+              <w:rPr>
+                <w:rFonts w:ascii="Times New Roman" w:hAnsi="Times New Roman" w:cs="Times New Roman"/>
+                <w:sz w:val="24"/>
+                <w:szCs w:val="24"/>
+                <w:lang w:val="en-US"/>
+              </w:rPr>
+            </w:pPr>
+            <w:r>
+              <w:rPr>
+                <w:rFonts w:ascii="Aptos Narrow" w:hAnsi="Aptos Narrow"/>
+                <w:color w:val="000000"/>
+              </w:rPr>
+              <w:t>18.63758</w:t>
+            </w:r>
+          </w:p>
+        </w:tc>
+        <w:tc>
+          <w:tcPr>
+            <w:tcW w:w="1389" w:type="dxa"/>
+            <w:vAlign w:val="bottom"/>
+          </w:tcPr>
+          <w:p>
+            <w:pPr>
+              <w:rPr>
+                <w:rFonts w:ascii="Times New Roman" w:hAnsi="Times New Roman" w:cs="Times New Roman"/>
+                <w:sz w:val="24"/>
+                <w:szCs w:val="24"/>
+                <w:lang w:val="en-US"/>
+              </w:rPr>
+            </w:pPr>
+            <w:r>
+              <w:rPr>
+                <w:rFonts w:ascii="Aptos Narrow" w:hAnsi="Aptos Narrow"/>
+                <w:color w:val="000000"/>
+              </w:rPr>
+              <w:t>13.24901265</w:t>
+            </w:r>
+          </w:p>
+        </w:tc>
+        <w:tc>
+          <w:tcPr>
+            <w:tcW w:w="1166" w:type="dxa"/>
+            <w:vAlign w:val="bottom"/>
+          </w:tcPr>
+          <w:p>
+            <w:pPr>
+              <w:rPr>
+                <w:rFonts w:ascii="Times New Roman" w:hAnsi="Times New Roman" w:cs="Times New Roman"/>
+                <w:sz w:val="24"/>
+                <w:szCs w:val="24"/>
+                <w:lang w:val="en-US"/>
+              </w:rPr>
+            </w:pPr>
+            <w:r>
+              <w:rPr>
+                <w:rFonts w:ascii="Aptos Narrow" w:hAnsi="Aptos Narrow"/>
+                <w:color w:val="000000"/>
+              </w:rPr>
+              <w:t>13.245478</w:t>
+            </w:r>
+          </w:p>
+        </w:tc>
+        <w:tc>
+          <w:tcPr>
+            <w:tcW w:w="1166" w:type="dxa"/>
+            <w:vAlign w:val="bottom"/>
+          </w:tcPr>
+          <w:p>
+            <w:pPr>
+              <w:rPr>
+                <w:rFonts w:ascii="Times New Roman" w:hAnsi="Times New Roman" w:cs="Times New Roman"/>
+                <w:sz w:val="24"/>
+                <w:szCs w:val="24"/>
+                <w:lang w:val="en-US"/>
+              </w:rPr>
+            </w:pPr>
+            <w:r>
+              <w:rPr>
+                <w:rFonts w:ascii="Aptos Narrow" w:hAnsi="Aptos Narrow"/>
+                <w:color w:val="000000"/>
+              </w:rPr>
+              <w:t>13.218057</w:t>
+            </w:r>
+          </w:p>
+        </w:tc>
+        <w:tc>
+          <w:tcPr>
+            <w:tcW w:w="1166" w:type="dxa"/>
+            <w:vAlign w:val="bottom"/>
+          </w:tcPr>
+          <w:p>
+            <w:pPr>
+              <w:rPr>
+                <w:rFonts w:ascii="Times New Roman" w:hAnsi="Times New Roman" w:cs="Times New Roman"/>
+                <w:sz w:val="24"/>
+                <w:szCs w:val="24"/>
+                <w:lang w:val="en-US"/>
+              </w:rPr>
+            </w:pPr>
+            <w:r>
+              <w:rPr>
+                <w:rFonts w:ascii="Aptos Narrow" w:hAnsi="Aptos Narrow"/>
+                <w:color w:val="000000"/>
+              </w:rPr>
+              <w:t>13.290487</w:t>
+            </w:r>
+          </w:p>
+        </w:tc>
+        <w:tc>
+          <w:tcPr>
+            <w:tcW w:w="1166" w:type="dxa"/>
+            <w:vAlign w:val="bottom"/>
+          </w:tcPr>
+          <w:p>
+            <w:pPr>
+              <w:rPr>
+                <w:rFonts w:ascii="Times New Roman" w:hAnsi="Times New Roman" w:cs="Times New Roman"/>
+                <w:sz w:val="24"/>
+                <w:szCs w:val="24"/>
+                <w:lang w:val="en-US"/>
+              </w:rPr>
+            </w:pPr>
+            <w:r>
+              <w:rPr>
+                <w:rFonts w:ascii="Aptos Narrow" w:hAnsi="Aptos Narrow"/>
+                <w:color w:val="000000"/>
+              </w:rPr>
+              <w:t>13.8154</w:t>
+            </w:r>
+          </w:p>
+        </w:tc>
+        <w:tc>
+          <w:tcPr>
+            <w:tcW w:w="1270" w:type="dxa"/>
+            <w:vAlign w:val="bottom"/>
+          </w:tcPr>
+          <w:p>
+            <w:pPr>
+              <w:rPr>
+                <w:rFonts w:ascii="Times New Roman" w:hAnsi="Times New Roman" w:cs="Times New Roman"/>
+                <w:sz w:val="24"/>
+                <w:szCs w:val="24"/>
+                <w:lang w:val="en-US"/>
+              </w:rPr>
+            </w:pPr>
+            <w:r>
+              <w:rPr>
+                <w:rFonts w:ascii="Aptos Narrow" w:hAnsi="Aptos Narrow"/>
+                <w:color w:val="000000"/>
+              </w:rPr>
+              <w:t>12.92945</w:t>
+            </w:r>
+          </w:p>
+        </w:tc>
+      </w:tr>
+      <w:tr>
+        <w:trPr>
+          <w:jc w:val="center"/>
+        </w:trPr>
+        <w:tc>
+          <w:tcPr>
+            <w:tcW w:w="1608" w:type="dxa"/>
+            <w:shd w:val="clear" w:color="auto" w:fill="83CAEB" w:themeFill="accent1" w:themeFillTint="66"/>
+            <w:vAlign w:val="bottom"/>
+          </w:tcPr>
+          <w:p>
+            <w:pPr>
+              <w:rPr>
+                <w:rFonts w:ascii="Times New Roman" w:hAnsi="Times New Roman" w:cs="Times New Roman"/>
+                <w:sz w:val="24"/>
+                <w:szCs w:val="24"/>
+                <w:lang w:val="en-US"/>
+              </w:rPr>
+            </w:pPr>
+            <w:r>
+              <w:rPr>
+                <w:rFonts w:ascii="Aptos Narrow" w:hAnsi="Aptos Narrow"/>
+                <w:color w:val="000000"/>
+              </w:rPr>
+              <w:t>433.milc</w:t>
+            </w:r>
+          </w:p>
+        </w:tc>
+        <w:tc>
+          <w:tcPr>
+            <w:tcW w:w="1054" w:type="dxa"/>
+            <w:vAlign w:val="bottom"/>
+          </w:tcPr>
+          <w:p>
+            <w:pPr>
+              <w:rPr>
+                <w:rFonts w:ascii="Times New Roman" w:hAnsi="Times New Roman" w:cs="Times New Roman"/>
+                <w:sz w:val="24"/>
+                <w:szCs w:val="24"/>
+                <w:lang w:val="en-US"/>
+              </w:rPr>
+            </w:pPr>
+            <w:r>
+              <w:rPr>
+                <w:rFonts w:ascii="Aptos Narrow" w:hAnsi="Aptos Narrow"/>
+                <w:color w:val="000000"/>
+              </w:rPr>
+              <w:t>25.94049</w:t>
+            </w:r>
+          </w:p>
+        </w:tc>
+        <w:tc>
+          <w:tcPr>
+            <w:tcW w:w="1389" w:type="dxa"/>
+            <w:vAlign w:val="bottom"/>
+          </w:tcPr>
+          <w:p>
+            <w:pPr>
+              <w:rPr>
+                <w:rFonts w:ascii="Times New Roman" w:hAnsi="Times New Roman" w:cs="Times New Roman"/>
+                <w:sz w:val="24"/>
+                <w:szCs w:val="24"/>
+                <w:lang w:val="en-US"/>
+              </w:rPr>
+            </w:pPr>
+            <w:r>
+              <w:rPr>
+                <w:rFonts w:ascii="Aptos Narrow" w:hAnsi="Aptos Narrow"/>
+                <w:color w:val="000000"/>
+              </w:rPr>
+              <w:t>12.99138051</w:t>
+            </w:r>
+          </w:p>
+        </w:tc>
+        <w:tc>
+          <w:tcPr>
+            <w:tcW w:w="1166" w:type="dxa"/>
+            <w:vAlign w:val="bottom"/>
+          </w:tcPr>
+          <w:p>
+            <w:pPr>
+              <w:rPr>
+                <w:rFonts w:ascii="Times New Roman" w:hAnsi="Times New Roman" w:cs="Times New Roman"/>
+                <w:sz w:val="24"/>
+                <w:szCs w:val="24"/>
+                <w:lang w:val="en-US"/>
+              </w:rPr>
+            </w:pPr>
+            <w:r>
+              <w:rPr>
+                <w:rFonts w:ascii="Aptos Narrow" w:hAnsi="Aptos Narrow"/>
+                <w:color w:val="000000"/>
+              </w:rPr>
+              <w:t>35.162068</w:t>
+            </w:r>
+          </w:p>
+        </w:tc>
+        <w:tc>
+          <w:tcPr>
+            <w:tcW w:w="1166" w:type="dxa"/>
+            <w:vAlign w:val="bottom"/>
+          </w:tcPr>
+          <w:p>
+            <w:pPr>
+              <w:rPr>
+                <w:rFonts w:ascii="Times New Roman" w:hAnsi="Times New Roman" w:cs="Times New Roman"/>
+                <w:sz w:val="24"/>
+                <w:szCs w:val="24"/>
+                <w:lang w:val="en-US"/>
+              </w:rPr>
+            </w:pPr>
+            <w:r>
+              <w:rPr>
+                <w:rFonts w:ascii="Aptos Narrow" w:hAnsi="Aptos Narrow"/>
+                <w:color w:val="000000"/>
+              </w:rPr>
+              <w:t>12.993855</w:t>
+            </w:r>
+          </w:p>
+        </w:tc>
+        <w:tc>
+          <w:tcPr>
+            <w:tcW w:w="1166" w:type="dxa"/>
+            <w:vAlign w:val="bottom"/>
+          </w:tcPr>
+          <w:p>
+            <w:pPr>
+              <w:rPr>
+                <w:rFonts w:ascii="Times New Roman" w:hAnsi="Times New Roman" w:cs="Times New Roman"/>
+                <w:sz w:val="24"/>
+                <w:szCs w:val="24"/>
+                <w:lang w:val="en-US"/>
+              </w:rPr>
+            </w:pPr>
+            <w:r>
+              <w:rPr>
+                <w:rFonts w:ascii="Aptos Narrow" w:hAnsi="Aptos Narrow"/>
+                <w:color w:val="000000"/>
+              </w:rPr>
+              <w:t>12.99437</w:t>
+            </w:r>
+          </w:p>
+        </w:tc>
+        <w:tc>
+          <w:tcPr>
+            <w:tcW w:w="1166" w:type="dxa"/>
+            <w:vAlign w:val="bottom"/>
+          </w:tcPr>
+          <w:p>
+            <w:pPr>
+              <w:rPr>
+                <w:rFonts w:ascii="Times New Roman" w:hAnsi="Times New Roman" w:cs="Times New Roman"/>
+                <w:sz w:val="24"/>
+                <w:szCs w:val="24"/>
+                <w:lang w:val="en-US"/>
+              </w:rPr>
+            </w:pPr>
+            <w:r>
+              <w:rPr>
+                <w:rFonts w:ascii="Aptos Narrow" w:hAnsi="Aptos Narrow"/>
+                <w:color w:val="000000"/>
+              </w:rPr>
+              <w:t>25.835565</w:t>
+            </w:r>
+          </w:p>
+        </w:tc>
+        <w:tc>
+          <w:tcPr>
+            <w:tcW w:w="1270" w:type="dxa"/>
+            <w:vAlign w:val="bottom"/>
+          </w:tcPr>
+          <w:p>
+            <w:pPr>
+              <w:rPr>
+                <w:rFonts w:ascii="Times New Roman" w:hAnsi="Times New Roman" w:cs="Times New Roman"/>
+                <w:sz w:val="24"/>
+                <w:szCs w:val="24"/>
+                <w:lang w:val="en-US"/>
+              </w:rPr>
+            </w:pPr>
+            <w:r>
+              <w:rPr>
+                <w:rFonts w:ascii="Aptos Narrow" w:hAnsi="Aptos Narrow"/>
+                <w:color w:val="000000"/>
+              </w:rPr>
+              <w:t>12.98655</w:t>
+            </w:r>
+          </w:p>
+        </w:tc>
+      </w:tr>
+      <w:tr>
+        <w:trPr>
+          <w:jc w:val="center"/>
+        </w:trPr>
+        <w:tc>
+          <w:tcPr>
+            <w:tcW w:w="1608" w:type="dxa"/>
+            <w:shd w:val="clear" w:color="auto" w:fill="83CAEB" w:themeFill="accent1" w:themeFillTint="66"/>
+            <w:vAlign w:val="bottom"/>
+          </w:tcPr>
+          <w:p>
+            <w:pPr>
+              <w:rPr>
+                <w:rFonts w:ascii="Times New Roman" w:hAnsi="Times New Roman" w:cs="Times New Roman"/>
+                <w:sz w:val="24"/>
+                <w:szCs w:val="24"/>
+                <w:lang w:val="en-US"/>
+              </w:rPr>
+            </w:pPr>
+            <w:r>
+              <w:rPr>
+                <w:rFonts w:ascii="Aptos Narrow" w:hAnsi="Aptos Narrow"/>
+                <w:color w:val="000000"/>
+              </w:rPr>
+              <w:t>435.gromacs</w:t>
+            </w:r>
+          </w:p>
+        </w:tc>
+        <w:tc>
+          <w:tcPr>
+            <w:tcW w:w="1054" w:type="dxa"/>
+            <w:vAlign w:val="bottom"/>
+          </w:tcPr>
+          <w:p>
+            <w:pPr>
+              <w:rPr>
+                <w:rFonts w:ascii="Times New Roman" w:hAnsi="Times New Roman" w:cs="Times New Roman"/>
+                <w:sz w:val="24"/>
+                <w:szCs w:val="24"/>
+                <w:lang w:val="en-US"/>
+              </w:rPr>
+            </w:pPr>
+            <w:r>
+              <w:rPr>
+                <w:rFonts w:ascii="Aptos Narrow" w:hAnsi="Aptos Narrow"/>
+                <w:color w:val="000000"/>
+              </w:rPr>
+              <w:t>3.863887</w:t>
+            </w:r>
+          </w:p>
+        </w:tc>
+        <w:tc>
+          <w:tcPr>
+            <w:tcW w:w="1389" w:type="dxa"/>
+            <w:vAlign w:val="bottom"/>
+          </w:tcPr>
+          <w:p>
+            <w:pPr>
+              <w:rPr>
+                <w:rFonts w:ascii="Times New Roman" w:hAnsi="Times New Roman" w:cs="Times New Roman"/>
+                <w:sz w:val="24"/>
+                <w:szCs w:val="24"/>
+                <w:lang w:val="en-US"/>
+              </w:rPr>
+            </w:pPr>
+            <w:r>
+              <w:rPr>
+                <w:rFonts w:ascii="Aptos Narrow" w:hAnsi="Aptos Narrow"/>
+                <w:color w:val="000000"/>
+              </w:rPr>
+              <w:t>3.031460432</w:t>
+            </w:r>
+          </w:p>
+        </w:tc>
+        <w:tc>
+          <w:tcPr>
+            <w:tcW w:w="1166" w:type="dxa"/>
+            <w:vAlign w:val="bottom"/>
+          </w:tcPr>
+          <w:p>
+            <w:pPr>
+              <w:rPr>
+                <w:rFonts w:ascii="Times New Roman" w:hAnsi="Times New Roman" w:cs="Times New Roman"/>
+                <w:sz w:val="24"/>
+                <w:szCs w:val="24"/>
+                <w:lang w:val="en-US"/>
+              </w:rPr>
+            </w:pPr>
+            <w:r>
+              <w:rPr>
+                <w:rFonts w:ascii="Aptos Narrow" w:hAnsi="Aptos Narrow"/>
+                <w:color w:val="000000"/>
+              </w:rPr>
+              <w:t>3.8992495</w:t>
+            </w:r>
+          </w:p>
+        </w:tc>
+        <w:tc>
+          <w:tcPr>
+            <w:tcW w:w="1166" w:type="dxa"/>
+            <w:vAlign w:val="bottom"/>
+          </w:tcPr>
+          <w:p>
+            <w:pPr>
+              <w:rPr>
+                <w:rFonts w:ascii="Times New Roman" w:hAnsi="Times New Roman" w:cs="Times New Roman"/>
+                <w:sz w:val="24"/>
+                <w:szCs w:val="24"/>
+                <w:lang w:val="en-US"/>
+              </w:rPr>
+            </w:pPr>
+            <w:r>
+              <w:rPr>
+                <w:rFonts w:ascii="Aptos Narrow" w:hAnsi="Aptos Narrow"/>
+                <w:color w:val="000000"/>
+              </w:rPr>
+              <w:t>3.0760819</w:t>
+            </w:r>
+          </w:p>
+        </w:tc>
+        <w:tc>
+          <w:tcPr>
+            <w:tcW w:w="1166" w:type="dxa"/>
+            <w:vAlign w:val="bottom"/>
+          </w:tcPr>
+          <w:p>
+            <w:pPr>
+              <w:rPr>
+                <w:rFonts w:ascii="Times New Roman" w:hAnsi="Times New Roman" w:cs="Times New Roman"/>
+                <w:sz w:val="24"/>
+                <w:szCs w:val="24"/>
+                <w:lang w:val="en-US"/>
+              </w:rPr>
+            </w:pPr>
+            <w:r>
+              <w:rPr>
+                <w:rFonts w:ascii="Aptos Narrow" w:hAnsi="Aptos Narrow"/>
+                <w:color w:val="000000"/>
+              </w:rPr>
+              <w:t>3.0917203</w:t>
+            </w:r>
+          </w:p>
+        </w:tc>
+        <w:tc>
+          <w:tcPr>
+            <w:tcW w:w="1166" w:type="dxa"/>
+            <w:vAlign w:val="bottom"/>
+          </w:tcPr>
+          <w:p>
+            <w:pPr>
+              <w:rPr>
+                <w:rFonts w:ascii="Times New Roman" w:hAnsi="Times New Roman" w:cs="Times New Roman"/>
+                <w:sz w:val="24"/>
+                <w:szCs w:val="24"/>
+                <w:lang w:val="en-US"/>
+              </w:rPr>
+            </w:pPr>
+            <w:r>
+              <w:rPr>
+                <w:rFonts w:ascii="Aptos Narrow" w:hAnsi="Aptos Narrow"/>
+                <w:color w:val="000000"/>
+              </w:rPr>
+              <w:t>3.5901743</w:t>
+            </w:r>
+          </w:p>
+        </w:tc>
+        <w:tc>
+          <w:tcPr>
+            <w:tcW w:w="1270" w:type="dxa"/>
+            <w:vAlign w:val="bottom"/>
+          </w:tcPr>
+          <w:p>
+            <w:pPr>
+              <w:rPr>
+                <w:rFonts w:ascii="Times New Roman" w:hAnsi="Times New Roman" w:cs="Times New Roman"/>
+                <w:sz w:val="24"/>
+                <w:szCs w:val="24"/>
+                <w:lang w:val="en-US"/>
+              </w:rPr>
+            </w:pPr>
+            <w:r>
+              <w:rPr>
+                <w:rFonts w:ascii="Aptos Narrow" w:hAnsi="Aptos Narrow"/>
+                <w:color w:val="000000"/>
+              </w:rPr>
+              <w:t>3.387616</w:t>
+            </w:r>
+          </w:p>
+        </w:tc>
+      </w:tr>
+      <w:tr>
+        <w:trPr>
+          <w:jc w:val="center"/>
+        </w:trPr>
+        <w:tc>
+          <w:tcPr>
+            <w:tcW w:w="1608" w:type="dxa"/>
+            <w:shd w:val="clear" w:color="auto" w:fill="83CAEB" w:themeFill="accent1" w:themeFillTint="66"/>
+            <w:vAlign w:val="bottom"/>
+          </w:tcPr>
+          <w:p>
+            <w:pPr>
+              <w:rPr>
+                <w:rFonts w:ascii="Times New Roman" w:hAnsi="Times New Roman" w:cs="Times New Roman"/>
+                <w:sz w:val="24"/>
+                <w:szCs w:val="24"/>
+                <w:lang w:val="en-US"/>
+              </w:rPr>
+            </w:pPr>
+            <w:r>
+              <w:rPr>
+                <w:rFonts w:ascii="Aptos Narrow" w:hAnsi="Aptos Narrow"/>
+                <w:color w:val="000000"/>
+              </w:rPr>
+              <w:t>436.cactusADM</w:t>
+            </w:r>
+          </w:p>
+        </w:tc>
+        <w:tc>
+          <w:tcPr>
+            <w:tcW w:w="1054" w:type="dxa"/>
+            <w:vAlign w:val="bottom"/>
+          </w:tcPr>
+          <w:p>
+            <w:pPr>
+              <w:rPr>
+                <w:rFonts w:ascii="Times New Roman" w:hAnsi="Times New Roman" w:cs="Times New Roman"/>
+                <w:sz w:val="24"/>
+                <w:szCs w:val="24"/>
+                <w:lang w:val="en-US"/>
+              </w:rPr>
+            </w:pPr>
+            <w:r>
+              <w:rPr>
+                <w:rFonts w:ascii="Aptos Narrow" w:hAnsi="Aptos Narrow"/>
+                <w:color w:val="000000"/>
+              </w:rPr>
+              <w:t>0.071817</w:t>
+            </w:r>
+          </w:p>
+        </w:tc>
+        <w:tc>
+          <w:tcPr>
+            <w:tcW w:w="1389" w:type="dxa"/>
+            <w:vAlign w:val="bottom"/>
+          </w:tcPr>
+          <w:p>
+            <w:pPr>
+              <w:rPr>
+                <w:rFonts w:ascii="Times New Roman" w:hAnsi="Times New Roman" w:cs="Times New Roman"/>
+                <w:sz w:val="24"/>
+                <w:szCs w:val="24"/>
+                <w:lang w:val="en-US"/>
+              </w:rPr>
+            </w:pPr>
+            <w:r>
+              <w:rPr>
+                <w:rFonts w:ascii="Aptos Narrow" w:hAnsi="Aptos Narrow"/>
+                <w:color w:val="000000"/>
+              </w:rPr>
+              <w:t>0.03895257</w:t>
+            </w:r>
+          </w:p>
+        </w:tc>
+        <w:tc>
+          <w:tcPr>
+            <w:tcW w:w="1166" w:type="dxa"/>
+            <w:vAlign w:val="bottom"/>
+          </w:tcPr>
+          <w:p>
+            <w:pPr>
+              <w:rPr>
+                <w:rFonts w:ascii="Times New Roman" w:hAnsi="Times New Roman" w:cs="Times New Roman"/>
+                <w:sz w:val="24"/>
+                <w:szCs w:val="24"/>
+                <w:lang w:val="en-US"/>
+              </w:rPr>
+            </w:pPr>
+            <w:r>
+              <w:rPr>
+                <w:rFonts w:ascii="Aptos Narrow" w:hAnsi="Aptos Narrow"/>
+                <w:color w:val="000000"/>
+              </w:rPr>
+              <w:t>0.0372779</w:t>
+            </w:r>
+          </w:p>
+        </w:tc>
+        <w:tc>
+          <w:tcPr>
+            <w:tcW w:w="1166" w:type="dxa"/>
+            <w:vAlign w:val="bottom"/>
+          </w:tcPr>
+          <w:p>
+            <w:pPr>
+              <w:rPr>
+                <w:rFonts w:ascii="Times New Roman" w:hAnsi="Times New Roman" w:cs="Times New Roman"/>
+                <w:sz w:val="24"/>
+                <w:szCs w:val="24"/>
+                <w:lang w:val="en-US"/>
+              </w:rPr>
+            </w:pPr>
+            <w:r>
+              <w:rPr>
+                <w:rFonts w:ascii="Aptos Narrow" w:hAnsi="Aptos Narrow"/>
+                <w:color w:val="000000"/>
+              </w:rPr>
+              <w:t>0.0373131</w:t>
+            </w:r>
+          </w:p>
+        </w:tc>
+        <w:tc>
+          <w:tcPr>
+            <w:tcW w:w="1166" w:type="dxa"/>
+            <w:vAlign w:val="bottom"/>
+          </w:tcPr>
+          <w:p>
+            <w:pPr>
+              <w:rPr>
+                <w:rFonts w:ascii="Times New Roman" w:hAnsi="Times New Roman" w:cs="Times New Roman"/>
+                <w:sz w:val="24"/>
+                <w:szCs w:val="24"/>
+                <w:lang w:val="en-US"/>
+              </w:rPr>
+            </w:pPr>
+            <w:r>
+              <w:rPr>
+                <w:rFonts w:ascii="Aptos Narrow" w:hAnsi="Aptos Narrow"/>
+                <w:color w:val="000000"/>
+              </w:rPr>
+              <w:t>0.0373041</w:t>
+            </w:r>
+          </w:p>
+        </w:tc>
+        <w:tc>
+          <w:tcPr>
+            <w:tcW w:w="1166" w:type="dxa"/>
+            <w:vAlign w:val="bottom"/>
+          </w:tcPr>
+          <w:p>
+            <w:pPr>
+              <w:rPr>
+                <w:rFonts w:ascii="Times New Roman" w:hAnsi="Times New Roman" w:cs="Times New Roman"/>
+                <w:sz w:val="24"/>
+                <w:szCs w:val="24"/>
+                <w:lang w:val="en-US"/>
+              </w:rPr>
+            </w:pPr>
+            <w:r>
+              <w:rPr>
+                <w:rFonts w:ascii="Aptos Narrow" w:hAnsi="Aptos Narrow"/>
+                <w:color w:val="000000"/>
+              </w:rPr>
+              <w:t>0.0375455</w:t>
+            </w:r>
+          </w:p>
+        </w:tc>
+        <w:tc>
+          <w:tcPr>
+            <w:tcW w:w="1270" w:type="dxa"/>
+            <w:vAlign w:val="bottom"/>
+          </w:tcPr>
+          <w:p>
+            <w:pPr>
+              <w:rPr>
+                <w:rFonts w:ascii="Times New Roman" w:hAnsi="Times New Roman" w:cs="Times New Roman"/>
+                <w:sz w:val="24"/>
+                <w:szCs w:val="24"/>
+                <w:lang w:val="en-US"/>
+              </w:rPr>
+            </w:pPr>
+            <w:r>
+              <w:rPr>
+                <w:rFonts w:ascii="Aptos Narrow" w:hAnsi="Aptos Narrow"/>
+                <w:color w:val="000000"/>
+              </w:rPr>
+              <w:t>0.037724</w:t>
+            </w:r>
+          </w:p>
+        </w:tc>
+      </w:tr>
+      <w:tr>
+        <w:trPr>
+          <w:jc w:val="center"/>
+        </w:trPr>
+        <w:tc>
+          <w:tcPr>
+            <w:tcW w:w="1608" w:type="dxa"/>
+            <w:shd w:val="clear" w:color="auto" w:fill="83CAEB" w:themeFill="accent1" w:themeFillTint="66"/>
+            <w:vAlign w:val="bottom"/>
+          </w:tcPr>
+          <w:p>
+            <w:pPr>
+              <w:rPr>
+                <w:rFonts w:ascii="Times New Roman" w:hAnsi="Times New Roman" w:cs="Times New Roman"/>
+                <w:sz w:val="24"/>
+                <w:szCs w:val="24"/>
+                <w:lang w:val="en-US"/>
+              </w:rPr>
+            </w:pPr>
+            <w:r>
+              <w:rPr>
+                <w:rFonts w:ascii="Aptos Narrow" w:hAnsi="Aptos Narrow"/>
+                <w:color w:val="000000"/>
+              </w:rPr>
+              <w:t>450.soplex</w:t>
+            </w:r>
+          </w:p>
+        </w:tc>
+        <w:tc>
+          <w:tcPr>
+            <w:tcW w:w="1054" w:type="dxa"/>
+            <w:vAlign w:val="bottom"/>
+          </w:tcPr>
+          <w:p>
+            <w:pPr>
+              <w:rPr>
+                <w:rFonts w:ascii="Times New Roman" w:hAnsi="Times New Roman" w:cs="Times New Roman"/>
+                <w:sz w:val="24"/>
+                <w:szCs w:val="24"/>
+                <w:lang w:val="en-US"/>
+              </w:rPr>
+            </w:pPr>
+            <w:r>
+              <w:rPr>
+                <w:rFonts w:ascii="Aptos Narrow" w:hAnsi="Aptos Narrow"/>
+                <w:color w:val="000000"/>
+              </w:rPr>
+              <w:t>13.79258</w:t>
+            </w:r>
+          </w:p>
+        </w:tc>
+        <w:tc>
+          <w:tcPr>
+            <w:tcW w:w="1389" w:type="dxa"/>
+            <w:vAlign w:val="bottom"/>
+          </w:tcPr>
+          <w:p>
+            <w:pPr>
+              <w:rPr>
+                <w:rFonts w:ascii="Times New Roman" w:hAnsi="Times New Roman" w:cs="Times New Roman"/>
+                <w:sz w:val="24"/>
+                <w:szCs w:val="24"/>
+                <w:lang w:val="en-US"/>
+              </w:rPr>
+            </w:pPr>
+            <w:r>
+              <w:rPr>
+                <w:rFonts w:ascii="Aptos Narrow" w:hAnsi="Aptos Narrow"/>
+                <w:color w:val="000000"/>
+              </w:rPr>
+              <w:t>8.551953203</w:t>
+            </w:r>
+          </w:p>
+        </w:tc>
+        <w:tc>
+          <w:tcPr>
+            <w:tcW w:w="1166" w:type="dxa"/>
+            <w:vAlign w:val="bottom"/>
+          </w:tcPr>
+          <w:p>
+            <w:pPr>
+              <w:rPr>
+                <w:rFonts w:ascii="Times New Roman" w:hAnsi="Times New Roman" w:cs="Times New Roman"/>
+                <w:sz w:val="24"/>
+                <w:szCs w:val="24"/>
+                <w:lang w:val="en-US"/>
+              </w:rPr>
+            </w:pPr>
+            <w:r>
+              <w:rPr>
+                <w:rFonts w:ascii="Aptos Narrow" w:hAnsi="Aptos Narrow"/>
+                <w:color w:val="000000"/>
+              </w:rPr>
+              <w:t>8.6535416</w:t>
+            </w:r>
+          </w:p>
+        </w:tc>
+        <w:tc>
+          <w:tcPr>
+            <w:tcW w:w="1166" w:type="dxa"/>
+            <w:vAlign w:val="bottom"/>
+          </w:tcPr>
+          <w:p>
+            <w:pPr>
+              <w:rPr>
+                <w:rFonts w:ascii="Times New Roman" w:hAnsi="Times New Roman" w:cs="Times New Roman"/>
+                <w:sz w:val="24"/>
+                <w:szCs w:val="24"/>
+                <w:lang w:val="en-US"/>
+              </w:rPr>
+            </w:pPr>
+            <w:r>
+              <w:rPr>
+                <w:rFonts w:ascii="Aptos Narrow" w:hAnsi="Aptos Narrow"/>
+                <w:color w:val="000000"/>
+              </w:rPr>
+              <w:t>8.6183861</w:t>
+            </w:r>
+          </w:p>
+        </w:tc>
+        <w:tc>
+          <w:tcPr>
+            <w:tcW w:w="1166" w:type="dxa"/>
+            <w:vAlign w:val="bottom"/>
+          </w:tcPr>
+          <w:p>
+            <w:pPr>
+              <w:rPr>
+                <w:rFonts w:ascii="Times New Roman" w:hAnsi="Times New Roman" w:cs="Times New Roman"/>
+                <w:sz w:val="24"/>
+                <w:szCs w:val="24"/>
+                <w:lang w:val="en-US"/>
+              </w:rPr>
+            </w:pPr>
+            <w:r>
+              <w:rPr>
+                <w:rFonts w:ascii="Aptos Narrow" w:hAnsi="Aptos Narrow"/>
+                <w:color w:val="000000"/>
+              </w:rPr>
+              <w:t>8.6725332</w:t>
+            </w:r>
+          </w:p>
+        </w:tc>
+        <w:tc>
+          <w:tcPr>
+            <w:tcW w:w="1166" w:type="dxa"/>
+            <w:vAlign w:val="bottom"/>
+          </w:tcPr>
+          <w:p>
+            <w:pPr>
+              <w:rPr>
+                <w:rFonts w:ascii="Times New Roman" w:hAnsi="Times New Roman" w:cs="Times New Roman"/>
+                <w:sz w:val="24"/>
+                <w:szCs w:val="24"/>
+                <w:lang w:val="en-US"/>
+              </w:rPr>
+            </w:pPr>
+            <w:r>
+              <w:rPr>
+                <w:rFonts w:ascii="Aptos Narrow" w:hAnsi="Aptos Narrow"/>
+                <w:color w:val="000000"/>
+              </w:rPr>
+              <w:t>10.374136</w:t>
+            </w:r>
+          </w:p>
+        </w:tc>
+        <w:tc>
+          <w:tcPr>
+            <w:tcW w:w="1270" w:type="dxa"/>
+            <w:vAlign w:val="bottom"/>
+          </w:tcPr>
+          <w:p>
+            <w:pPr>
+              <w:rPr>
+                <w:rFonts w:ascii="Times New Roman" w:hAnsi="Times New Roman" w:cs="Times New Roman"/>
+                <w:sz w:val="24"/>
+                <w:szCs w:val="24"/>
+                <w:lang w:val="en-US"/>
+              </w:rPr>
+            </w:pPr>
+            <w:r>
+              <w:rPr>
+                <w:rFonts w:ascii="Aptos Narrow" w:hAnsi="Aptos Narrow"/>
+                <w:color w:val="000000"/>
+              </w:rPr>
+              <w:t>9.012606</w:t>
+            </w:r>
+          </w:p>
+        </w:tc>
+      </w:tr>
+      <w:tr>
+        <w:trPr>
+          <w:jc w:val="center"/>
+        </w:trPr>
+        <w:tc>
+          <w:tcPr>
+            <w:tcW w:w="1608" w:type="dxa"/>
+            <w:shd w:val="clear" w:color="auto" w:fill="83CAEB" w:themeFill="accent1" w:themeFillTint="66"/>
+            <w:vAlign w:val="bottom"/>
+          </w:tcPr>
+          <w:p>
+            <w:pPr>
+              <w:rPr>
+                <w:rFonts w:ascii="Times New Roman" w:hAnsi="Times New Roman" w:cs="Times New Roman"/>
+                <w:sz w:val="24"/>
+                <w:szCs w:val="24"/>
+                <w:lang w:val="en-US"/>
+              </w:rPr>
+            </w:pPr>
+            <w:r>
+              <w:rPr>
+                <w:rFonts w:ascii="Aptos Narrow" w:hAnsi="Aptos Narrow"/>
+                <w:color w:val="000000"/>
+              </w:rPr>
+              <w:t>459.GemsFDTD</w:t>
+            </w:r>
+          </w:p>
+        </w:tc>
+        <w:tc>
+          <w:tcPr>
+            <w:tcW w:w="1054" w:type="dxa"/>
+            <w:vAlign w:val="bottom"/>
+          </w:tcPr>
+          <w:p>
+            <w:pPr>
+              <w:rPr>
+                <w:rFonts w:ascii="Times New Roman" w:hAnsi="Times New Roman" w:cs="Times New Roman"/>
+                <w:sz w:val="24"/>
+                <w:szCs w:val="24"/>
+                <w:lang w:val="en-US"/>
+              </w:rPr>
+            </w:pPr>
+            <w:r>
+              <w:rPr>
+                <w:rFonts w:ascii="Aptos Narrow" w:hAnsi="Aptos Narrow"/>
+                <w:color w:val="000000"/>
+              </w:rPr>
+              <w:t>0.794057</w:t>
+            </w:r>
+          </w:p>
+        </w:tc>
+        <w:tc>
+          <w:tcPr>
+            <w:tcW w:w="1389" w:type="dxa"/>
+            <w:vAlign w:val="bottom"/>
+          </w:tcPr>
+          <w:p>
+            <w:pPr>
+              <w:rPr>
+                <w:rFonts w:ascii="Times New Roman" w:hAnsi="Times New Roman" w:cs="Times New Roman"/>
+                <w:sz w:val="24"/>
+                <w:szCs w:val="24"/>
+                <w:lang w:val="en-US"/>
+              </w:rPr>
+            </w:pPr>
+            <w:r>
+              <w:rPr>
+                <w:rFonts w:ascii="Aptos Narrow" w:hAnsi="Aptos Narrow"/>
+                <w:color w:val="000000"/>
+              </w:rPr>
+              <w:t>0.43728757</w:t>
+            </w:r>
+          </w:p>
+        </w:tc>
+        <w:tc>
+          <w:tcPr>
+            <w:tcW w:w="1166" w:type="dxa"/>
+            <w:vAlign w:val="bottom"/>
+          </w:tcPr>
+          <w:p>
+            <w:pPr>
+              <w:rPr>
+                <w:rFonts w:ascii="Times New Roman" w:hAnsi="Times New Roman" w:cs="Times New Roman"/>
+                <w:sz w:val="24"/>
+                <w:szCs w:val="24"/>
+                <w:lang w:val="en-US"/>
+              </w:rPr>
+            </w:pPr>
+            <w:r>
+              <w:rPr>
+                <w:rFonts w:ascii="Aptos Narrow" w:hAnsi="Aptos Narrow"/>
+                <w:color w:val="000000"/>
+              </w:rPr>
+              <w:t>0.4395898</w:t>
+            </w:r>
+          </w:p>
+        </w:tc>
+        <w:tc>
+          <w:tcPr>
+            <w:tcW w:w="1166" w:type="dxa"/>
+            <w:vAlign w:val="bottom"/>
+          </w:tcPr>
+          <w:p>
+            <w:pPr>
+              <w:rPr>
+                <w:rFonts w:ascii="Times New Roman" w:hAnsi="Times New Roman" w:cs="Times New Roman"/>
+                <w:sz w:val="24"/>
+                <w:szCs w:val="24"/>
+                <w:lang w:val="en-US"/>
+              </w:rPr>
+            </w:pPr>
+            <w:r>
+              <w:rPr>
+                <w:rFonts w:ascii="Aptos Narrow" w:hAnsi="Aptos Narrow"/>
+                <w:color w:val="000000"/>
+              </w:rPr>
+              <w:t>0.4444762</w:t>
+            </w:r>
+          </w:p>
+        </w:tc>
+        <w:tc>
+          <w:tcPr>
+            <w:tcW w:w="1166" w:type="dxa"/>
+            <w:vAlign w:val="bottom"/>
+          </w:tcPr>
+          <w:p>
+            <w:pPr>
+              <w:rPr>
+                <w:rFonts w:ascii="Times New Roman" w:hAnsi="Times New Roman" w:cs="Times New Roman"/>
+                <w:sz w:val="24"/>
+                <w:szCs w:val="24"/>
+                <w:lang w:val="en-US"/>
+              </w:rPr>
+            </w:pPr>
+            <w:r>
+              <w:rPr>
+                <w:rFonts w:ascii="Aptos Narrow" w:hAnsi="Aptos Narrow"/>
+                <w:color w:val="000000"/>
+              </w:rPr>
+              <w:t>0.439477</w:t>
+            </w:r>
+          </w:p>
+        </w:tc>
+        <w:tc>
+          <w:tcPr>
+            <w:tcW w:w="1166" w:type="dxa"/>
+            <w:vAlign w:val="bottom"/>
+          </w:tcPr>
+          <w:p>
+            <w:pPr>
+              <w:rPr>
+                <w:rFonts w:ascii="Times New Roman" w:hAnsi="Times New Roman" w:cs="Times New Roman"/>
+                <w:sz w:val="24"/>
+                <w:szCs w:val="24"/>
+                <w:lang w:val="en-US"/>
+              </w:rPr>
+            </w:pPr>
+            <w:r>
+              <w:rPr>
+                <w:rFonts w:ascii="Aptos Narrow" w:hAnsi="Aptos Narrow"/>
+                <w:color w:val="000000"/>
+              </w:rPr>
+              <w:t>0.5691379</w:t>
+            </w:r>
+          </w:p>
+        </w:tc>
+        <w:tc>
+          <w:tcPr>
+            <w:tcW w:w="1270" w:type="dxa"/>
+            <w:vAlign w:val="bottom"/>
+          </w:tcPr>
+          <w:p>
+            <w:pPr>
+              <w:rPr>
+                <w:rFonts w:ascii="Times New Roman" w:hAnsi="Times New Roman" w:cs="Times New Roman"/>
+                <w:sz w:val="24"/>
+                <w:szCs w:val="24"/>
+                <w:lang w:val="en-US"/>
+              </w:rPr>
+            </w:pPr>
+            <w:r>
+              <w:rPr>
+                <w:rFonts w:ascii="Aptos Narrow" w:hAnsi="Aptos Narrow"/>
+                <w:color w:val="000000"/>
+              </w:rPr>
+              <w:t>0.421004</w:t>
+            </w:r>
+          </w:p>
+        </w:tc>
+      </w:tr>
+      <w:tr>
+        <w:trPr>
+          <w:jc w:val="center"/>
+        </w:trPr>
+        <w:tc>
+          <w:tcPr>
+            <w:tcW w:w="1608" w:type="dxa"/>
+            <w:shd w:val="clear" w:color="auto" w:fill="83CAEB" w:themeFill="accent1" w:themeFillTint="66"/>
+            <w:vAlign w:val="bottom"/>
+          </w:tcPr>
+          <w:p>
+            <w:pPr>
+              <w:rPr>
+                <w:rFonts w:ascii="Times New Roman" w:hAnsi="Times New Roman" w:cs="Times New Roman"/>
+                <w:sz w:val="24"/>
+                <w:szCs w:val="24"/>
+                <w:lang w:val="en-US"/>
+              </w:rPr>
+            </w:pPr>
+            <w:r>
+              <w:rPr>
+                <w:rFonts w:ascii="Aptos Narrow" w:hAnsi="Aptos Narrow"/>
+                <w:color w:val="000000"/>
+              </w:rPr>
+              <w:t>470.lbm</w:t>
+            </w:r>
+          </w:p>
+        </w:tc>
+        <w:tc>
+          <w:tcPr>
+            <w:tcW w:w="1054" w:type="dxa"/>
+            <w:vAlign w:val="bottom"/>
+          </w:tcPr>
+          <w:p>
+            <w:pPr>
+              <w:rPr>
+                <w:rFonts w:ascii="Times New Roman" w:hAnsi="Times New Roman" w:cs="Times New Roman"/>
+                <w:sz w:val="24"/>
+                <w:szCs w:val="24"/>
+                <w:lang w:val="en-US"/>
+              </w:rPr>
+            </w:pPr>
+            <w:r>
+              <w:rPr>
+                <w:rFonts w:ascii="Aptos Narrow" w:hAnsi="Aptos Narrow"/>
+                <w:color w:val="000000"/>
+              </w:rPr>
+              <w:t>0.192757</w:t>
+            </w:r>
+          </w:p>
+        </w:tc>
+        <w:tc>
+          <w:tcPr>
+            <w:tcW w:w="1389" w:type="dxa"/>
+            <w:vAlign w:val="bottom"/>
+          </w:tcPr>
+          <w:p>
+            <w:pPr>
+              <w:rPr>
+                <w:rFonts w:ascii="Times New Roman" w:hAnsi="Times New Roman" w:cs="Times New Roman"/>
+                <w:sz w:val="24"/>
+                <w:szCs w:val="24"/>
+                <w:lang w:val="en-US"/>
+              </w:rPr>
+            </w:pPr>
+            <w:r>
+              <w:rPr>
+                <w:rFonts w:ascii="Aptos Narrow" w:hAnsi="Aptos Narrow"/>
+                <w:color w:val="000000"/>
+              </w:rPr>
+              <w:t>0.333523504</w:t>
+            </w:r>
+          </w:p>
+        </w:tc>
+        <w:tc>
+          <w:tcPr>
+            <w:tcW w:w="1166" w:type="dxa"/>
+            <w:vAlign w:val="bottom"/>
+          </w:tcPr>
+          <w:p>
+            <w:pPr>
+              <w:rPr>
+                <w:rFonts w:ascii="Times New Roman" w:hAnsi="Times New Roman" w:cs="Times New Roman"/>
+                <w:sz w:val="24"/>
+                <w:szCs w:val="24"/>
+                <w:lang w:val="en-US"/>
+              </w:rPr>
+            </w:pPr>
+            <w:r>
+              <w:rPr>
+                <w:rFonts w:ascii="Aptos Narrow" w:hAnsi="Aptos Narrow"/>
+                <w:color w:val="000000"/>
+              </w:rPr>
+              <w:t>0.3364321</w:t>
+            </w:r>
+          </w:p>
+        </w:tc>
+        <w:tc>
+          <w:tcPr>
+            <w:tcW w:w="1166" w:type="dxa"/>
+            <w:vAlign w:val="bottom"/>
+          </w:tcPr>
+          <w:p>
+            <w:pPr>
+              <w:rPr>
+                <w:rFonts w:ascii="Times New Roman" w:hAnsi="Times New Roman" w:cs="Times New Roman"/>
+                <w:sz w:val="24"/>
+                <w:szCs w:val="24"/>
+                <w:lang w:val="en-US"/>
+              </w:rPr>
+            </w:pPr>
+            <w:r>
+              <w:rPr>
+                <w:rFonts w:ascii="Aptos Narrow" w:hAnsi="Aptos Narrow"/>
+                <w:color w:val="000000"/>
+              </w:rPr>
+              <w:t>0.366637</w:t>
+            </w:r>
+          </w:p>
+        </w:tc>
+        <w:tc>
+          <w:tcPr>
+            <w:tcW w:w="1166" w:type="dxa"/>
+            <w:vAlign w:val="bottom"/>
+          </w:tcPr>
+          <w:p>
+            <w:pPr>
+              <w:rPr>
+                <w:rFonts w:ascii="Times New Roman" w:hAnsi="Times New Roman" w:cs="Times New Roman"/>
+                <w:sz w:val="24"/>
+                <w:szCs w:val="24"/>
+                <w:lang w:val="en-US"/>
+              </w:rPr>
+            </w:pPr>
+            <w:r>
+              <w:rPr>
+                <w:rFonts w:ascii="Aptos Narrow" w:hAnsi="Aptos Narrow"/>
+                <w:color w:val="000000"/>
+              </w:rPr>
+              <w:t>0.3704017</w:t>
+            </w:r>
+          </w:p>
+        </w:tc>
+        <w:tc>
+          <w:tcPr>
+            <w:tcW w:w="1166" w:type="dxa"/>
+            <w:vAlign w:val="bottom"/>
+          </w:tcPr>
+          <w:p>
+            <w:pPr>
+              <w:rPr>
+                <w:rFonts w:ascii="Times New Roman" w:hAnsi="Times New Roman" w:cs="Times New Roman"/>
+                <w:sz w:val="24"/>
+                <w:szCs w:val="24"/>
+                <w:lang w:val="en-US"/>
+              </w:rPr>
+            </w:pPr>
+            <w:r>
+              <w:rPr>
+                <w:rFonts w:ascii="Aptos Narrow" w:hAnsi="Aptos Narrow"/>
+                <w:color w:val="000000"/>
+              </w:rPr>
+              <w:t>0.3208838</w:t>
+            </w:r>
+          </w:p>
+        </w:tc>
+        <w:tc>
+          <w:tcPr>
+            <w:tcW w:w="1270" w:type="dxa"/>
+            <w:vAlign w:val="bottom"/>
+          </w:tcPr>
+          <w:p>
+            <w:pPr>
+              <w:rPr>
+                <w:rFonts w:ascii="Times New Roman" w:hAnsi="Times New Roman" w:cs="Times New Roman"/>
+                <w:sz w:val="24"/>
+                <w:szCs w:val="24"/>
+                <w:lang w:val="en-US"/>
+              </w:rPr>
+            </w:pPr>
+            <w:r>
+              <w:rPr>
+                <w:rFonts w:ascii="Aptos Narrow" w:hAnsi="Aptos Narrow"/>
+                <w:color w:val="000000"/>
+              </w:rPr>
+              <w:t>0.778982</w:t>
+            </w:r>
+          </w:p>
+        </w:tc>
+      </w:tr>
+      <w:tr>
+        <w:trPr>
+          <w:jc w:val="center"/>
+        </w:trPr>
+        <w:tc>
+          <w:tcPr>
+            <w:tcW w:w="1608" w:type="dxa"/>
+            <w:shd w:val="clear" w:color="auto" w:fill="83CAEB" w:themeFill="accent1" w:themeFillTint="66"/>
+            <w:vAlign w:val="bottom"/>
+          </w:tcPr>
+          <w:p>
+            <w:pPr>
+              <w:rPr>
+                <w:rFonts w:ascii="Times New Roman" w:hAnsi="Times New Roman" w:cs="Times New Roman"/>
+                <w:sz w:val="24"/>
+                <w:szCs w:val="24"/>
+                <w:lang w:val="en-US"/>
+              </w:rPr>
+            </w:pPr>
+            <w:r>
+              <w:rPr>
+                <w:rFonts w:ascii="Aptos Narrow" w:hAnsi="Aptos Narrow"/>
+                <w:color w:val="000000"/>
+              </w:rPr>
+              <w:t>483.xalancbmk</w:t>
+            </w:r>
+          </w:p>
+        </w:tc>
+        <w:tc>
+          <w:tcPr>
+            <w:tcW w:w="1054" w:type="dxa"/>
+            <w:vAlign w:val="bottom"/>
+          </w:tcPr>
+          <w:p>
+            <w:pPr>
+              <w:rPr>
+                <w:rFonts w:ascii="Times New Roman" w:hAnsi="Times New Roman" w:cs="Times New Roman"/>
+                <w:sz w:val="24"/>
+                <w:szCs w:val="24"/>
+                <w:lang w:val="en-US"/>
+              </w:rPr>
+            </w:pPr>
+            <w:r>
+              <w:rPr>
+                <w:rFonts w:ascii="Aptos Narrow" w:hAnsi="Aptos Narrow"/>
+                <w:color w:val="000000"/>
+              </w:rPr>
+              <w:t>15.83363</w:t>
+            </w:r>
+          </w:p>
+        </w:tc>
+        <w:tc>
+          <w:tcPr>
+            <w:tcW w:w="1389" w:type="dxa"/>
+            <w:vAlign w:val="bottom"/>
+          </w:tcPr>
+          <w:p>
+            <w:pPr>
+              <w:rPr>
+                <w:rFonts w:ascii="Times New Roman" w:hAnsi="Times New Roman" w:cs="Times New Roman"/>
+                <w:sz w:val="24"/>
+                <w:szCs w:val="24"/>
+                <w:lang w:val="en-US"/>
+              </w:rPr>
+            </w:pPr>
+            <w:r>
+              <w:rPr>
+                <w:rFonts w:ascii="Aptos Narrow" w:hAnsi="Aptos Narrow"/>
+                <w:color w:val="000000"/>
+              </w:rPr>
+              <w:t>11.20596289</w:t>
+            </w:r>
+          </w:p>
+        </w:tc>
+        <w:tc>
+          <w:tcPr>
+            <w:tcW w:w="1166" w:type="dxa"/>
+            <w:vAlign w:val="bottom"/>
+          </w:tcPr>
+          <w:p>
+            <w:pPr>
+              <w:rPr>
+                <w:rFonts w:ascii="Times New Roman" w:hAnsi="Times New Roman" w:cs="Times New Roman"/>
+                <w:sz w:val="24"/>
+                <w:szCs w:val="24"/>
+                <w:lang w:val="en-US"/>
+              </w:rPr>
+            </w:pPr>
+            <w:r>
+              <w:rPr>
+                <w:rFonts w:ascii="Aptos Narrow" w:hAnsi="Aptos Narrow"/>
+                <w:color w:val="000000"/>
+              </w:rPr>
+              <w:t>11.511484</w:t>
+            </w:r>
+          </w:p>
+        </w:tc>
+        <w:tc>
+          <w:tcPr>
+            <w:tcW w:w="1166" w:type="dxa"/>
+            <w:vAlign w:val="bottom"/>
+          </w:tcPr>
+          <w:p>
+            <w:pPr>
+              <w:rPr>
+                <w:rFonts w:ascii="Times New Roman" w:hAnsi="Times New Roman" w:cs="Times New Roman"/>
+                <w:sz w:val="24"/>
+                <w:szCs w:val="24"/>
+                <w:lang w:val="en-US"/>
+              </w:rPr>
+            </w:pPr>
+            <w:r>
+              <w:rPr>
+                <w:rFonts w:ascii="Aptos Narrow" w:hAnsi="Aptos Narrow"/>
+                <w:color w:val="000000"/>
+              </w:rPr>
+              <w:t>12.544612</w:t>
+            </w:r>
+          </w:p>
+        </w:tc>
+        <w:tc>
+          <w:tcPr>
+            <w:tcW w:w="1166" w:type="dxa"/>
+            <w:vAlign w:val="bottom"/>
+          </w:tcPr>
+          <w:p>
+            <w:pPr>
+              <w:rPr>
+                <w:rFonts w:ascii="Times New Roman" w:hAnsi="Times New Roman" w:cs="Times New Roman"/>
+                <w:sz w:val="24"/>
+                <w:szCs w:val="24"/>
+                <w:lang w:val="en-US"/>
+              </w:rPr>
+            </w:pPr>
+            <w:r>
+              <w:rPr>
+                <w:rFonts w:ascii="Aptos Narrow" w:hAnsi="Aptos Narrow"/>
+                <w:color w:val="000000"/>
+              </w:rPr>
+              <w:t>12.020186</w:t>
+            </w:r>
+          </w:p>
+        </w:tc>
+        <w:tc>
+          <w:tcPr>
+            <w:tcW w:w="1166" w:type="dxa"/>
+            <w:vAlign w:val="bottom"/>
+          </w:tcPr>
+          <w:p>
+            <w:pPr>
+              <w:rPr>
+                <w:rFonts w:ascii="Times New Roman" w:hAnsi="Times New Roman" w:cs="Times New Roman"/>
+                <w:sz w:val="24"/>
+                <w:szCs w:val="24"/>
+                <w:lang w:val="en-US"/>
+              </w:rPr>
+            </w:pPr>
+            <w:r>
+              <w:rPr>
+                <w:rFonts w:ascii="Aptos Narrow" w:hAnsi="Aptos Narrow"/>
+                <w:color w:val="000000"/>
+              </w:rPr>
+              <w:t>13.191644</w:t>
+            </w:r>
+          </w:p>
+        </w:tc>
+        <w:tc>
+          <w:tcPr>
+            <w:tcW w:w="1270" w:type="dxa"/>
+            <w:vAlign w:val="bottom"/>
+          </w:tcPr>
+          <w:p>
+            <w:pPr>
+              <w:rPr>
+                <w:rFonts w:ascii="Times New Roman" w:hAnsi="Times New Roman" w:cs="Times New Roman"/>
+                <w:sz w:val="24"/>
+                <w:szCs w:val="24"/>
+                <w:lang w:val="en-US"/>
+              </w:rPr>
+            </w:pPr>
+            <w:r>
+              <w:rPr>
+                <w:rFonts w:ascii="Aptos Narrow" w:hAnsi="Aptos Narrow"/>
+                <w:color w:val="000000"/>
+              </w:rPr>
+              <w:t>10.4997</w:t>
+            </w:r>
+          </w:p>
+        </w:tc>
+      </w:tr>
+      <w:tr>
+        <w:trPr>
+          <w:jc w:val="center"/>
+        </w:trPr>
+        <w:tc>
+          <w:tcPr>
+            <w:tcW w:w="1608" w:type="dxa"/>
+            <w:shd w:val="clear" w:color="auto" w:fill="FF7474"/>
+            <w:vAlign w:val="bottom"/>
+          </w:tcPr>
+          <w:p>
+            <w:pPr>
+              <w:rPr>
+                <w:rFonts w:ascii="Times New Roman" w:hAnsi="Times New Roman" w:cs="Times New Roman"/>
+                <w:sz w:val="24"/>
+                <w:szCs w:val="24"/>
+                <w:lang w:val="en-US"/>
+              </w:rPr>
+            </w:pPr>
+            <w:r>
+              <w:rPr>
+                <w:rFonts w:ascii="Aptos Narrow" w:hAnsi="Aptos Narrow"/>
+                <w:color w:val="000000"/>
+              </w:rPr>
+              <w:t>AVERAGE</w:t>
+            </w:r>
+          </w:p>
+        </w:tc>
+        <w:tc>
+          <w:tcPr>
+            <w:tcW w:w="1054" w:type="dxa"/>
+            <w:shd w:val="clear" w:color="auto" w:fill="FF7474"/>
+            <w:vAlign w:val="bottom"/>
+          </w:tcPr>
+          <w:p>
+            <w:pPr>
+              <w:rPr>
+                <w:rFonts w:ascii="Times New Roman" w:hAnsi="Times New Roman" w:cs="Times New Roman"/>
+                <w:sz w:val="24"/>
+                <w:szCs w:val="24"/>
+                <w:lang w:val="en-US"/>
+              </w:rPr>
+            </w:pPr>
+            <w:r>
+              <w:rPr>
+                <w:rFonts w:ascii="Aptos Narrow" w:hAnsi="Aptos Narrow"/>
+                <w:color w:val="000000"/>
+              </w:rPr>
+              <w:t>12.22795</w:t>
+            </w:r>
+          </w:p>
+        </w:tc>
+        <w:tc>
+          <w:tcPr>
+            <w:tcW w:w="1389" w:type="dxa"/>
+            <w:shd w:val="clear" w:color="auto" w:fill="FF7474"/>
+            <w:vAlign w:val="bottom"/>
+          </w:tcPr>
+          <w:p>
+            <w:pPr>
+              <w:rPr>
+                <w:rFonts w:ascii="Times New Roman" w:hAnsi="Times New Roman" w:cs="Times New Roman"/>
+                <w:sz w:val="24"/>
+                <w:szCs w:val="24"/>
+                <w:lang w:val="en-US"/>
+              </w:rPr>
+            </w:pPr>
+            <w:r>
+              <w:rPr>
+                <w:rFonts w:ascii="Aptos Narrow" w:hAnsi="Aptos Narrow"/>
+                <w:color w:val="000000"/>
+              </w:rPr>
+              <w:t>7.768728753</w:t>
+            </w:r>
+          </w:p>
+        </w:tc>
+        <w:tc>
+          <w:tcPr>
+            <w:tcW w:w="1166" w:type="dxa"/>
+            <w:shd w:val="clear" w:color="auto" w:fill="FF7474"/>
+            <w:vAlign w:val="bottom"/>
+          </w:tcPr>
+          <w:p>
+            <w:pPr>
+              <w:rPr>
+                <w:rFonts w:ascii="Times New Roman" w:hAnsi="Times New Roman" w:cs="Times New Roman"/>
+                <w:sz w:val="24"/>
+                <w:szCs w:val="24"/>
+                <w:lang w:val="en-US"/>
+              </w:rPr>
+            </w:pPr>
+            <w:r>
+              <w:rPr>
+                <w:rFonts w:ascii="Aptos Narrow" w:hAnsi="Aptos Narrow"/>
+                <w:color w:val="000000"/>
+              </w:rPr>
+              <w:t>10.07954</w:t>
+            </w:r>
+          </w:p>
+        </w:tc>
+        <w:tc>
+          <w:tcPr>
+            <w:tcW w:w="1166" w:type="dxa"/>
+            <w:shd w:val="clear" w:color="auto" w:fill="FF7474"/>
+            <w:vAlign w:val="bottom"/>
+          </w:tcPr>
+          <w:p>
+            <w:pPr>
+              <w:rPr>
+                <w:rFonts w:ascii="Times New Roman" w:hAnsi="Times New Roman" w:cs="Times New Roman"/>
+                <w:sz w:val="24"/>
+                <w:szCs w:val="24"/>
+                <w:lang w:val="en-US"/>
+              </w:rPr>
+            </w:pPr>
+            <w:r>
+              <w:rPr>
+                <w:rFonts w:ascii="Aptos Narrow" w:hAnsi="Aptos Narrow"/>
+                <w:color w:val="000000"/>
+              </w:rPr>
+              <w:t>7.9395837</w:t>
+            </w:r>
+          </w:p>
+        </w:tc>
+        <w:tc>
+          <w:tcPr>
+            <w:tcW w:w="1166" w:type="dxa"/>
+            <w:shd w:val="clear" w:color="auto" w:fill="FF7474"/>
+            <w:vAlign w:val="bottom"/>
+          </w:tcPr>
+          <w:p>
+            <w:pPr>
+              <w:rPr>
+                <w:rFonts w:ascii="Times New Roman" w:hAnsi="Times New Roman" w:cs="Times New Roman"/>
+                <w:sz w:val="24"/>
+                <w:szCs w:val="24"/>
+                <w:lang w:val="en-US"/>
+              </w:rPr>
+            </w:pPr>
+            <w:r>
+              <w:rPr>
+                <w:rFonts w:ascii="Aptos Narrow" w:hAnsi="Aptos Narrow"/>
+                <w:color w:val="000000"/>
+              </w:rPr>
+              <w:t>7.9018725</w:t>
+            </w:r>
+          </w:p>
+        </w:tc>
+        <w:tc>
+          <w:tcPr>
+            <w:tcW w:w="1166" w:type="dxa"/>
+            <w:shd w:val="clear" w:color="auto" w:fill="FF7474"/>
+            <w:vAlign w:val="bottom"/>
+          </w:tcPr>
+          <w:p>
+            <w:pPr>
+              <w:rPr>
+                <w:rFonts w:ascii="Times New Roman" w:hAnsi="Times New Roman" w:cs="Times New Roman"/>
+                <w:sz w:val="24"/>
+                <w:szCs w:val="24"/>
+                <w:lang w:val="en-US"/>
+              </w:rPr>
+            </w:pPr>
+            <w:r>
+              <w:rPr>
+                <w:rFonts w:ascii="Aptos Narrow" w:hAnsi="Aptos Narrow"/>
+                <w:color w:val="000000"/>
+              </w:rPr>
+              <w:t>10.140103</w:t>
+            </w:r>
+          </w:p>
+        </w:tc>
+        <w:tc>
+          <w:tcPr>
+            <w:tcW w:w="1270" w:type="dxa"/>
+            <w:shd w:val="clear" w:color="auto" w:fill="FF7474"/>
+            <w:vAlign w:val="bottom"/>
+          </w:tcPr>
+          <w:p>
+            <w:pPr>
+              <w:rPr>
+                <w:rFonts w:ascii="Times New Roman" w:hAnsi="Times New Roman" w:cs="Times New Roman"/>
+                <w:sz w:val="24"/>
+                <w:szCs w:val="24"/>
+                <w:lang w:val="en-US"/>
+              </w:rPr>
+            </w:pPr>
+            <w:r>
+              <w:rPr>
+                <w:rFonts w:ascii="Aptos Narrow" w:hAnsi="Aptos Narrow"/>
+                <w:color w:val="000000"/>
+              </w:rPr>
+              <w:t>7.</w:t>
+            </w:r>
+            <w:r>
+              <w:rPr>
+                <w:rFonts w:ascii="Aptos Narrow" w:hAnsi="Aptos Narrow"/>
+                <w:color w:val="000000"/>
+                <w:shd w:val="clear" w:color="auto" w:fill="FF7474"/>
+              </w:rPr>
+              <w:t>781311</w:t>
+            </w:r>
+          </w:p>
+        </w:tc>
+      </w:tr>
+    </w:tbl>
+    <w:p>
+      <w:pPr>
+        <w:ind w:firstLine="720"/>
+        <w:rPr>
+          <w:rFonts w:ascii="Times New Roman" w:hAnsi="Times New Roman" w:cs="Times New Roman"/>
+          <w:sz w:val="24"/>
+          <w:szCs w:val="24"/>
+          <w:lang w:val="en-US"/>
+        </w:rPr>
+      </w:pPr>
+    </w:p>
+    <w:p>
+      <w:pPr>
+        <w:jc w:val="center"/>
+        <w:rPr>
+          <w:rFonts w:ascii="Times New Roman" w:hAnsi="Times New Roman" w:cs="Times New Roman"/>
+          <w:sz w:val="24"/>
+          <w:szCs w:val="24"/>
+          <w:lang w:val="en-US"/>
+        </w:rPr>
+      </w:pPr>
+      <w:r>
+        <w:rPr>
+          <w:rFonts w:ascii="Times New Roman" w:hAnsi="Times New Roman" w:cs="Times New Roman"/>
+          <w:sz w:val="24"/>
+          <w:szCs w:val="24"/>
+          <w:lang w:val="en-US"/>
+        </w:rPr>
+        <w:drawing>
+          <wp:inline distT="0" distB="0" distL="0" distR="0" wp14:anchorId="568A6612" wp14:editId="464EDCC6">
+            <wp:extent cx="5943600" cy="3566160"/>
+            <wp:effectExtent l="0" t="0" r="0" b="0"/>
+            <wp:docPr id="1203938898" name="Picture 4"/>
+            <wp:cNvGraphicFramePr>
+              <a:graphicFrameLocks xmlns:a="http://schemas.openxmlformats.org/drawingml/2006/main" noChangeAspect="1"/>
+            </wp:cNvGraphicFramePr>
+            <a:graphic xmlns:a="http://schemas.openxmlformats.org/drawingml/2006/main">
+              <a:graphicData uri="http://schemas.openxmlformats.org/drawingml/2006/picture">
+                <pic:pic xmlns:pic="http://schemas.openxmlformats.org/drawingml/2006/picture">
+                  <pic:nvPicPr>
+                    <pic:cNvPr id="0" name="Picture 13"/>
+                    <pic:cNvPicPr>
+                      <a:picLocks noChangeAspect="1" noChangeArrowheads="1"/>
+                    </pic:cNvPicPr>
+                  </pic:nvPicPr>
+                  <pic:blipFill>
+                    <a:blip r:embed="rId10" cstate="print">
+                      <a:extLst>
+                        <a:ext uri="{28A0092B-C50C-407E-A947-70E740481C1C}">
+                          <a14:useLocalDpi xmlns:a14="http://schemas.microsoft.com/office/drawing/2010/main" val="0"/>
+                        </a:ext>
+                      </a:extLst>
+                    </a:blip>
+                    <a:srcRect/>
+                    <a:stretch>
+                      <a:fillRect/>
+                    </a:stretch>
+                  </pic:blipFill>
+                  <pic:spPr bwMode="auto">
+                    <a:xfrm>
+                      <a:off x="0" y="0"/>
+                      <a:ext cx="5943600" cy="3566160"/>
+                    </a:xfrm>
+                    <a:prstGeom prst="rect">
+                      <a:avLst/>
+                    </a:prstGeom>
+                    <a:noFill/>
+                    <a:ln>
+                      <a:noFill/>
+                    </a:ln>
+                  </pic:spPr>
+                </pic:pic>
+              </a:graphicData>
+            </a:graphic>
+          </wp:inline>
+        </w:drawing>
+      </w:r>
+    </w:p>
+    <w:p>
+      <w:pPr>
+        <w:rPr>
+          <w:rFonts w:ascii="Times New Roman" w:hAnsi="Times New Roman" w:cs="Times New Roman"/>
+          <w:sz w:val="24"/>
+          <w:szCs w:val="24"/>
+          <w:lang w:val="en-US"/>
+        </w:rPr>
+      </w:pPr>
+    </w:p>
+    <w:p>
+      <w:pPr>
+        <w:rPr>
+          <w:rFonts w:ascii="Times New Roman" w:hAnsi="Times New Roman" w:cs="Times New Roman"/>
+          <w:sz w:val="24"/>
+          <w:szCs w:val="24"/>
+          <w:lang w:val="el-GR"/>
+        </w:rPr>
+      </w:pPr>
+      <w:r>
+        <w:rPr>
+          <w:rFonts w:ascii="Times New Roman" w:hAnsi="Times New Roman" w:cs="Times New Roman"/>
+          <w:sz w:val="24"/>
+          <w:szCs w:val="24"/>
+          <w:lang w:val="el-GR"/>
+        </w:rPr>
+        <w:lastRenderedPageBreak/>
+        <w:t xml:space="preserve">Παρατηρώ από τους παραπάνω </w:t>
+      </w:r>
+      <w:r>
+        <w:rPr>
+          <w:rFonts w:ascii="Times New Roman" w:hAnsi="Times New Roman" w:cs="Times New Roman"/>
+          <w:sz w:val="24"/>
+          <w:szCs w:val="24"/>
+          <w:lang w:val="en-US"/>
+        </w:rPr>
+        <w:t>plots</w:t>
+      </w:r>
+      <w:r>
+        <w:rPr>
+          <w:rFonts w:ascii="Times New Roman" w:hAnsi="Times New Roman" w:cs="Times New Roman"/>
+          <w:sz w:val="24"/>
+          <w:szCs w:val="24"/>
+          <w:lang w:val="el-GR"/>
+        </w:rPr>
+        <w:t xml:space="preserve"> </w:t>
+      </w:r>
+      <w:r>
+        <w:rPr>
+          <w:rFonts w:ascii="Times New Roman" w:hAnsi="Times New Roman" w:cs="Times New Roman"/>
+          <w:sz w:val="24"/>
+          <w:szCs w:val="24"/>
+          <w:lang w:val="el-GR"/>
+        </w:rPr>
+        <w:t>ότι ο 1</w:t>
+      </w:r>
+      <w:r>
+        <w:rPr>
+          <w:rFonts w:ascii="Times New Roman" w:hAnsi="Times New Roman" w:cs="Times New Roman"/>
+          <w:sz w:val="24"/>
+          <w:szCs w:val="24"/>
+          <w:lang w:val="en-US"/>
+        </w:rPr>
+        <w:t>bit</w:t>
+      </w:r>
+      <w:r>
+        <w:rPr>
+          <w:rFonts w:ascii="Times New Roman" w:hAnsi="Times New Roman" w:cs="Times New Roman"/>
+          <w:sz w:val="24"/>
+          <w:szCs w:val="24"/>
+          <w:lang w:val="el-GR"/>
+        </w:rPr>
+        <w:t xml:space="preserve"> </w:t>
+      </w:r>
+      <w:r>
+        <w:rPr>
+          <w:rFonts w:ascii="Times New Roman" w:hAnsi="Times New Roman" w:cs="Times New Roman"/>
+          <w:sz w:val="24"/>
+          <w:szCs w:val="24"/>
+          <w:lang w:val="el-GR"/>
+        </w:rPr>
+        <w:t xml:space="preserve">32Κ </w:t>
+      </w:r>
+      <w:r>
+        <w:rPr>
+          <w:rFonts w:ascii="Times New Roman" w:hAnsi="Times New Roman" w:cs="Times New Roman"/>
+          <w:sz w:val="24"/>
+          <w:szCs w:val="24"/>
+          <w:lang w:val="en-US"/>
+        </w:rPr>
+        <w:t>predictor</w:t>
+      </w:r>
+      <w:r>
+        <w:rPr>
+          <w:rFonts w:ascii="Times New Roman" w:hAnsi="Times New Roman" w:cs="Times New Roman"/>
+          <w:sz w:val="24"/>
+          <w:szCs w:val="24"/>
+          <w:lang w:val="el-GR"/>
+        </w:rPr>
+        <w:t xml:space="preserve"> </w:t>
+      </w:r>
+      <w:r>
+        <w:rPr>
+          <w:rFonts w:ascii="Times New Roman" w:hAnsi="Times New Roman" w:cs="Times New Roman"/>
+          <w:sz w:val="24"/>
+          <w:szCs w:val="24"/>
+          <w:lang w:val="el-GR"/>
+        </w:rPr>
+        <w:t xml:space="preserve">είναι ο χειρότερος καθώς με </w:t>
+      </w:r>
+      <w:r>
+        <w:rPr>
+          <w:rFonts w:ascii="Times New Roman" w:hAnsi="Times New Roman" w:cs="Times New Roman"/>
+          <w:sz w:val="24"/>
+          <w:szCs w:val="24"/>
+          <w:lang w:val="el-GR"/>
+        </w:rPr>
+        <w:t xml:space="preserve">1 </w:t>
+      </w:r>
+      <w:r>
+        <w:rPr>
+          <w:rFonts w:ascii="Times New Roman" w:hAnsi="Times New Roman" w:cs="Times New Roman"/>
+          <w:sz w:val="24"/>
+          <w:szCs w:val="24"/>
+          <w:lang w:val="en-US"/>
+        </w:rPr>
+        <w:t>bit</w:t>
+      </w:r>
+      <w:r>
+        <w:rPr>
+          <w:rFonts w:ascii="Times New Roman" w:hAnsi="Times New Roman" w:cs="Times New Roman"/>
+          <w:sz w:val="24"/>
+          <w:szCs w:val="24"/>
+          <w:lang w:val="el-GR"/>
+        </w:rPr>
+        <w:t xml:space="preserve"> </w:t>
+      </w:r>
+      <w:r>
+        <w:rPr>
+          <w:rFonts w:ascii="Times New Roman" w:hAnsi="Times New Roman" w:cs="Times New Roman"/>
+          <w:sz w:val="24"/>
+          <w:szCs w:val="24"/>
+          <w:lang w:val="el-GR"/>
+        </w:rPr>
+        <w:t xml:space="preserve">είναι πολύ απλός για να είναι αποτελεσματικός σε μεγάλο πλήθος </w:t>
+      </w:r>
+      <w:r>
+        <w:rPr>
+          <w:rFonts w:ascii="Times New Roman" w:hAnsi="Times New Roman" w:cs="Times New Roman"/>
+          <w:sz w:val="24"/>
+          <w:szCs w:val="24"/>
+          <w:lang w:val="en-US"/>
+        </w:rPr>
+        <w:t>benchmarks</w:t>
+      </w:r>
+      <w:r>
+        <w:rPr>
+          <w:rFonts w:ascii="Times New Roman" w:hAnsi="Times New Roman" w:cs="Times New Roman"/>
+          <w:sz w:val="24"/>
+          <w:szCs w:val="24"/>
+          <w:lang w:val="el-GR"/>
+        </w:rPr>
+        <w:t xml:space="preserve"> (</w:t>
+      </w:r>
+      <w:r>
+        <w:rPr>
+          <w:rFonts w:ascii="Times New Roman" w:hAnsi="Times New Roman" w:cs="Times New Roman"/>
+          <w:sz w:val="24"/>
+          <w:szCs w:val="24"/>
+          <w:lang w:val="el-GR"/>
+        </w:rPr>
+        <w:t xml:space="preserve">με ποικιλία </w:t>
+      </w:r>
+      <w:r>
+        <w:rPr>
+          <w:rFonts w:ascii="Times New Roman" w:hAnsi="Times New Roman" w:cs="Times New Roman"/>
+          <w:sz w:val="24"/>
+          <w:szCs w:val="24"/>
+          <w:lang w:val="en-US"/>
+        </w:rPr>
+        <w:t>complexity</w:t>
+      </w:r>
+      <w:r>
+        <w:rPr>
+          <w:rFonts w:ascii="Times New Roman" w:hAnsi="Times New Roman" w:cs="Times New Roman"/>
+          <w:sz w:val="24"/>
+          <w:szCs w:val="24"/>
+          <w:lang w:val="el-GR"/>
+        </w:rPr>
+        <w:t xml:space="preserve">). </w:t>
+      </w:r>
+      <w:r>
+        <w:rPr>
+          <w:rFonts w:ascii="Times New Roman" w:hAnsi="Times New Roman" w:cs="Times New Roman"/>
+          <w:sz w:val="24"/>
+          <w:szCs w:val="24"/>
+          <w:lang w:val="el-GR"/>
+        </w:rPr>
+        <w:t>Από εκεί και μετά παρατηρούμε 2 ομάδες μια είναι οι 2</w:t>
+      </w:r>
+      <w:r>
+        <w:rPr>
+          <w:rFonts w:ascii="Times New Roman" w:hAnsi="Times New Roman" w:cs="Times New Roman"/>
+          <w:sz w:val="24"/>
+          <w:szCs w:val="24"/>
+          <w:lang w:val="el-GR"/>
+        </w:rPr>
+        <w:t>-</w:t>
+      </w:r>
+      <w:r>
+        <w:rPr>
+          <w:rFonts w:ascii="Times New Roman" w:hAnsi="Times New Roman" w:cs="Times New Roman"/>
+          <w:sz w:val="24"/>
+          <w:szCs w:val="24"/>
+          <w:lang w:val="en-US"/>
+        </w:rPr>
+        <w:t>bit</w:t>
+      </w:r>
+      <w:r>
+        <w:rPr>
+          <w:rFonts w:ascii="Times New Roman" w:hAnsi="Times New Roman" w:cs="Times New Roman"/>
+          <w:sz w:val="24"/>
+          <w:szCs w:val="24"/>
+          <w:lang w:val="el-GR"/>
+        </w:rPr>
+        <w:t xml:space="preserve"> </w:t>
+      </w:r>
+      <w:r>
+        <w:rPr>
+          <w:rFonts w:ascii="Times New Roman" w:hAnsi="Times New Roman" w:cs="Times New Roman"/>
+          <w:sz w:val="24"/>
+          <w:szCs w:val="24"/>
+          <w:lang w:val="en-US"/>
+        </w:rPr>
+        <w:t>fsm</w:t>
+      </w:r>
+      <w:r>
+        <w:rPr>
+          <w:rFonts w:ascii="Times New Roman" w:hAnsi="Times New Roman" w:cs="Times New Roman"/>
+          <w:sz w:val="24"/>
+          <w:szCs w:val="24"/>
+          <w:lang w:val="el-GR"/>
+        </w:rPr>
+        <w:t xml:space="preserve"> 1,3,4 </w:t>
+      </w:r>
+      <w:r>
+        <w:rPr>
+          <w:rFonts w:ascii="Times New Roman" w:hAnsi="Times New Roman" w:cs="Times New Roman"/>
+          <w:sz w:val="24"/>
+          <w:szCs w:val="24"/>
+          <w:lang w:val="el-GR"/>
+        </w:rPr>
+        <w:t xml:space="preserve">και ο </w:t>
+      </w:r>
+      <w:r>
+        <w:rPr>
+          <w:rFonts w:ascii="Times New Roman" w:hAnsi="Times New Roman" w:cs="Times New Roman"/>
+          <w:sz w:val="24"/>
+          <w:szCs w:val="24"/>
+          <w:lang w:val="el-GR"/>
+        </w:rPr>
+        <w:t>4-</w:t>
+      </w:r>
+      <w:r>
+        <w:rPr>
+          <w:rFonts w:ascii="Times New Roman" w:hAnsi="Times New Roman" w:cs="Times New Roman"/>
+          <w:sz w:val="24"/>
+          <w:szCs w:val="24"/>
+          <w:lang w:val="en-US"/>
+        </w:rPr>
+        <w:t>bit</w:t>
+      </w:r>
+      <w:r>
+        <w:rPr>
+          <w:rFonts w:ascii="Times New Roman" w:hAnsi="Times New Roman" w:cs="Times New Roman"/>
+          <w:sz w:val="24"/>
+          <w:szCs w:val="24"/>
+          <w:lang w:val="el-GR"/>
+        </w:rPr>
+        <w:t xml:space="preserve"> (8</w:t>
+      </w:r>
+      <w:r>
+        <w:rPr>
+          <w:rFonts w:ascii="Times New Roman" w:hAnsi="Times New Roman" w:cs="Times New Roman"/>
+          <w:sz w:val="24"/>
+          <w:szCs w:val="24"/>
+          <w:lang w:val="en-US"/>
+        </w:rPr>
+        <w:t>k</w:t>
+      </w:r>
+      <w:r>
+        <w:rPr>
+          <w:rFonts w:ascii="Times New Roman" w:hAnsi="Times New Roman" w:cs="Times New Roman"/>
+          <w:sz w:val="24"/>
+          <w:szCs w:val="24"/>
+          <w:lang w:val="el-GR"/>
+        </w:rPr>
+        <w:t xml:space="preserve"> </w:t>
+      </w:r>
+      <w:r>
+        <w:rPr>
+          <w:rFonts w:ascii="Times New Roman" w:hAnsi="Times New Roman" w:cs="Times New Roman"/>
+          <w:sz w:val="24"/>
+          <w:szCs w:val="24"/>
+          <w:lang w:val="en-US"/>
+        </w:rPr>
+        <w:t>bht</w:t>
+      </w:r>
+      <w:r>
+        <w:rPr>
+          <w:rFonts w:ascii="Times New Roman" w:hAnsi="Times New Roman" w:cs="Times New Roman"/>
+          <w:sz w:val="24"/>
+          <w:szCs w:val="24"/>
+          <w:lang w:val="el-GR"/>
+        </w:rPr>
+        <w:t xml:space="preserve">) </w:t>
+      </w:r>
+      <w:r>
+        <w:rPr>
+          <w:rFonts w:ascii="Times New Roman" w:hAnsi="Times New Roman" w:cs="Times New Roman"/>
+          <w:sz w:val="24"/>
+          <w:szCs w:val="24"/>
+          <w:lang w:val="el-GR"/>
+        </w:rPr>
+        <w:t xml:space="preserve">που είναι οι </w:t>
+      </w:r>
+      <w:r>
+        <w:rPr>
+          <w:rFonts w:ascii="Times New Roman" w:hAnsi="Times New Roman" w:cs="Times New Roman"/>
+          <w:sz w:val="24"/>
+          <w:szCs w:val="24"/>
+          <w:lang w:val="el-GR"/>
+        </w:rPr>
+        <w:t>“</w:t>
+      </w:r>
+      <w:r>
+        <w:rPr>
+          <w:rFonts w:ascii="Times New Roman" w:hAnsi="Times New Roman" w:cs="Times New Roman"/>
+          <w:sz w:val="24"/>
+          <w:szCs w:val="24"/>
+          <w:lang w:val="el-GR"/>
+        </w:rPr>
+        <w:t>αποτελεσματική</w:t>
+      </w:r>
+      <w:r>
+        <w:rPr>
+          <w:rFonts w:ascii="Times New Roman" w:hAnsi="Times New Roman" w:cs="Times New Roman"/>
+          <w:sz w:val="24"/>
+          <w:szCs w:val="24"/>
+          <w:lang w:val="el-GR"/>
+        </w:rPr>
+        <w:t>”</w:t>
+      </w:r>
+      <w:r>
+        <w:rPr>
+          <w:rFonts w:ascii="Times New Roman" w:hAnsi="Times New Roman" w:cs="Times New Roman"/>
+          <w:sz w:val="24"/>
+          <w:szCs w:val="24"/>
+          <w:lang w:val="el-GR"/>
+        </w:rPr>
+        <w:t xml:space="preserve"> ομάδα και οι </w:t>
+      </w:r>
+      <w:r>
+        <w:rPr>
+          <w:rFonts w:ascii="Times New Roman" w:hAnsi="Times New Roman" w:cs="Times New Roman"/>
+          <w:sz w:val="24"/>
+          <w:szCs w:val="24"/>
+          <w:lang w:val="en-US"/>
+        </w:rPr>
+        <w:t>fsm</w:t>
+      </w:r>
+      <w:r>
+        <w:rPr>
+          <w:rFonts w:ascii="Times New Roman" w:hAnsi="Times New Roman" w:cs="Times New Roman"/>
+          <w:sz w:val="24"/>
+          <w:szCs w:val="24"/>
+          <w:lang w:val="el-GR"/>
+        </w:rPr>
+        <w:t xml:space="preserve"> 2</w:t>
+      </w:r>
+      <w:r>
+        <w:rPr>
+          <w:rFonts w:ascii="Times New Roman" w:hAnsi="Times New Roman" w:cs="Times New Roman"/>
+          <w:sz w:val="24"/>
+          <w:szCs w:val="24"/>
+          <w:lang w:val="el-GR"/>
+        </w:rPr>
+        <w:t xml:space="preserve"> και 5 που είναι η πιο κακή ομάδα. Για τους 2 και 5 το περιμέναμε καθώς από τους 5 πειραματικά καλύτερους </w:t>
+      </w:r>
+      <w:r>
+        <w:rPr>
+          <w:rFonts w:ascii="Times New Roman" w:hAnsi="Times New Roman" w:cs="Times New Roman"/>
+          <w:sz w:val="24"/>
+          <w:szCs w:val="24"/>
+          <w:lang w:val="en-US"/>
+        </w:rPr>
+        <w:t>predictors</w:t>
+      </w:r>
+      <w:r>
+        <w:rPr>
+          <w:rFonts w:ascii="Times New Roman" w:hAnsi="Times New Roman" w:cs="Times New Roman"/>
+          <w:sz w:val="24"/>
+          <w:szCs w:val="24"/>
+          <w:lang w:val="el-GR"/>
+        </w:rPr>
+        <w:t xml:space="preserve"> </w:t>
+      </w:r>
+      <w:r>
+        <w:rPr>
+          <w:rFonts w:ascii="Times New Roman" w:hAnsi="Times New Roman" w:cs="Times New Roman"/>
+          <w:sz w:val="24"/>
+          <w:szCs w:val="24"/>
+          <w:lang w:val="el-GR"/>
+        </w:rPr>
+        <w:t xml:space="preserve">ήταν αυτοι που και στο προηγούμενο ερώτημα είχαν χειρότερη απόδοση. Τέλος μιας και το </w:t>
+      </w:r>
+      <w:r>
+        <w:rPr>
+          <w:rFonts w:ascii="Times New Roman" w:hAnsi="Times New Roman" w:cs="Times New Roman"/>
+          <w:sz w:val="24"/>
+          <w:szCs w:val="24"/>
+          <w:lang w:val="en-US"/>
+        </w:rPr>
+        <w:t>hardware</w:t>
+      </w:r>
+      <w:r>
+        <w:rPr>
+          <w:rFonts w:ascii="Times New Roman" w:hAnsi="Times New Roman" w:cs="Times New Roman"/>
+          <w:sz w:val="24"/>
+          <w:szCs w:val="24"/>
+          <w:lang w:val="el-GR"/>
+        </w:rPr>
+        <w:t xml:space="preserve"> </w:t>
+      </w:r>
+      <w:r>
+        <w:rPr>
+          <w:rFonts w:ascii="Times New Roman" w:hAnsi="Times New Roman" w:cs="Times New Roman"/>
+          <w:sz w:val="24"/>
+          <w:szCs w:val="24"/>
+          <w:lang w:val="el-GR"/>
+        </w:rPr>
+        <w:t xml:space="preserve">παραμένει το ίδιο η απόφαση είναι απλή θα επέλεγα τον </w:t>
+      </w:r>
+      <w:r>
+        <w:rPr>
+          <w:rFonts w:ascii="Times New Roman" w:hAnsi="Times New Roman" w:cs="Times New Roman"/>
+          <w:sz w:val="24"/>
+          <w:szCs w:val="24"/>
+          <w:lang w:val="en-US"/>
+        </w:rPr>
+        <w:t>predictor</w:t>
+      </w:r>
+      <w:r>
+        <w:rPr>
+          <w:rFonts w:ascii="Times New Roman" w:hAnsi="Times New Roman" w:cs="Times New Roman"/>
+          <w:sz w:val="24"/>
+          <w:szCs w:val="24"/>
+          <w:lang w:val="el-GR"/>
+        </w:rPr>
+        <w:t xml:space="preserve"> </w:t>
+      </w:r>
+      <w:r>
+        <w:rPr>
+          <w:rFonts w:ascii="Times New Roman" w:hAnsi="Times New Roman" w:cs="Times New Roman"/>
+          <w:sz w:val="24"/>
+          <w:szCs w:val="24"/>
+          <w:lang w:val="el-GR"/>
+        </w:rPr>
+        <w:t xml:space="preserve">με το χαμηλότερο </w:t>
+      </w:r>
+      <w:r>
+        <w:rPr>
+          <w:rFonts w:ascii="Times New Roman" w:hAnsi="Times New Roman" w:cs="Times New Roman"/>
+          <w:sz w:val="24"/>
+          <w:szCs w:val="24"/>
+          <w:lang w:val="en-US"/>
+        </w:rPr>
+        <w:t>MPKI</w:t>
+      </w:r>
+      <w:r>
+        <w:rPr>
+          <w:rFonts w:ascii="Times New Roman" w:hAnsi="Times New Roman" w:cs="Times New Roman"/>
+          <w:sz w:val="24"/>
+          <w:szCs w:val="24"/>
+          <w:lang w:val="el-GR"/>
+        </w:rPr>
+        <w:t xml:space="preserve"> </w:t>
+      </w:r>
+      <w:r>
+        <w:rPr>
+          <w:rFonts w:ascii="Times New Roman" w:hAnsi="Times New Roman" w:cs="Times New Roman"/>
+          <w:sz w:val="24"/>
+          <w:szCs w:val="24"/>
+          <w:lang w:val="el-GR"/>
+        </w:rPr>
+        <w:t xml:space="preserve">δηλαδή το </w:t>
+      </w:r>
+      <w:r>
+        <w:rPr>
+          <w:rFonts w:ascii="Times New Roman" w:hAnsi="Times New Roman" w:cs="Times New Roman"/>
+          <w:sz w:val="24"/>
+          <w:szCs w:val="24"/>
+          <w:lang w:val="en-US"/>
+        </w:rPr>
+        <w:t>FSM</w:t>
+      </w:r>
+      <w:r>
+        <w:rPr>
+          <w:rFonts w:ascii="Times New Roman" w:hAnsi="Times New Roman" w:cs="Times New Roman"/>
+          <w:sz w:val="24"/>
+          <w:szCs w:val="24"/>
+          <w:lang w:val="el-GR"/>
+        </w:rPr>
+        <w:t xml:space="preserve">-1 </w:t>
+      </w:r>
+      <w:r>
+        <w:rPr>
+          <w:rFonts w:ascii="Times New Roman" w:hAnsi="Times New Roman" w:cs="Times New Roman"/>
+          <w:sz w:val="24"/>
+          <w:szCs w:val="24"/>
+          <w:lang w:val="el-GR"/>
+        </w:rPr>
+        <w:t xml:space="preserve">η αλλιώς τον απλό </w:t>
+      </w:r>
+      <w:r>
+        <w:rPr>
+          <w:rFonts w:ascii="Times New Roman" w:hAnsi="Times New Roman" w:cs="Times New Roman"/>
+          <w:sz w:val="24"/>
+          <w:szCs w:val="24"/>
+          <w:lang w:val="en-US"/>
+        </w:rPr>
+        <w:t>saturating</w:t>
+      </w:r>
+      <w:r>
+        <w:rPr>
+          <w:rFonts w:ascii="Times New Roman" w:hAnsi="Times New Roman" w:cs="Times New Roman"/>
+          <w:sz w:val="24"/>
+          <w:szCs w:val="24"/>
+          <w:lang w:val="el-GR"/>
+        </w:rPr>
+        <w:t xml:space="preserve"> </w:t>
+      </w:r>
+      <w:r>
+        <w:rPr>
+          <w:rFonts w:ascii="Times New Roman" w:hAnsi="Times New Roman" w:cs="Times New Roman"/>
+          <w:sz w:val="24"/>
+          <w:szCs w:val="24"/>
+          <w:lang w:val="en-US"/>
+        </w:rPr>
+        <w:t>counter</w:t>
+      </w:r>
+      <w:r>
+        <w:rPr>
+          <w:rFonts w:ascii="Times New Roman" w:hAnsi="Times New Roman" w:cs="Times New Roman"/>
+          <w:sz w:val="24"/>
+          <w:szCs w:val="24"/>
+          <w:lang w:val="el-GR"/>
+        </w:rPr>
+        <w:t>. (</w:t>
+      </w:r>
+      <w:r>
+        <w:rPr>
+          <w:rFonts w:ascii="Times New Roman" w:hAnsi="Times New Roman" w:cs="Times New Roman"/>
+          <w:sz w:val="24"/>
+          <w:szCs w:val="24"/>
+          <w:lang w:val="el-GR"/>
+        </w:rPr>
+        <w:t xml:space="preserve">Σημείωση παρατηρούμε ότι με την αύξηση του </w:t>
+      </w:r>
+      <w:r>
+        <w:rPr>
+          <w:rFonts w:ascii="Times New Roman" w:hAnsi="Times New Roman" w:cs="Times New Roman"/>
+          <w:sz w:val="24"/>
+          <w:szCs w:val="24"/>
+          <w:lang w:val="en-US"/>
+        </w:rPr>
+        <w:t>complexity</w:t>
+      </w:r>
+      <w:r>
+        <w:rPr>
+          <w:rFonts w:ascii="Times New Roman" w:hAnsi="Times New Roman" w:cs="Times New Roman"/>
+          <w:sz w:val="24"/>
+          <w:szCs w:val="24"/>
+          <w:lang w:val="el-GR"/>
+        </w:rPr>
+        <w:t xml:space="preserve"> </w:t>
+      </w:r>
+      <w:r>
+        <w:rPr>
+          <w:rFonts w:ascii="Times New Roman" w:hAnsi="Times New Roman" w:cs="Times New Roman"/>
+          <w:sz w:val="24"/>
+          <w:szCs w:val="24"/>
+          <w:lang w:val="el-GR"/>
+        </w:rPr>
+        <w:t>από 2 σε 4-</w:t>
+      </w:r>
+      <w:r>
+        <w:rPr>
+          <w:rFonts w:ascii="Times New Roman" w:hAnsi="Times New Roman" w:cs="Times New Roman"/>
+          <w:sz w:val="24"/>
+          <w:szCs w:val="24"/>
+          <w:lang w:val="en-US"/>
+        </w:rPr>
+        <w:t>bit</w:t>
+      </w:r>
+      <w:r>
+        <w:rPr>
+          <w:rFonts w:ascii="Times New Roman" w:hAnsi="Times New Roman" w:cs="Times New Roman"/>
+          <w:sz w:val="24"/>
+          <w:szCs w:val="24"/>
+          <w:lang w:val="el-GR"/>
+        </w:rPr>
+        <w:t xml:space="preserve"> </w:t>
+      </w:r>
+      <w:r>
+        <w:rPr>
+          <w:rFonts w:ascii="Times New Roman" w:hAnsi="Times New Roman" w:cs="Times New Roman"/>
+          <w:sz w:val="24"/>
+          <w:szCs w:val="24"/>
+          <w:lang w:val="el-GR"/>
+        </w:rPr>
+        <w:t xml:space="preserve">όχι μόνο δεν καλυτερεύει η απόδοση του </w:t>
+      </w:r>
+      <w:r>
+        <w:rPr>
+          <w:rFonts w:ascii="Times New Roman" w:hAnsi="Times New Roman" w:cs="Times New Roman"/>
+          <w:sz w:val="24"/>
+          <w:szCs w:val="24"/>
+          <w:lang w:val="en-US"/>
+        </w:rPr>
+        <w:t>predictor</w:t>
+      </w:r>
+      <w:r>
+        <w:rPr>
+          <w:rFonts w:ascii="Times New Roman" w:hAnsi="Times New Roman" w:cs="Times New Roman"/>
+          <w:sz w:val="24"/>
+          <w:szCs w:val="24"/>
+          <w:lang w:val="el-GR"/>
+        </w:rPr>
+        <w:t xml:space="preserve"> </w:t>
+      </w:r>
+      <w:r>
+        <w:rPr>
+          <w:rFonts w:ascii="Times New Roman" w:hAnsi="Times New Roman" w:cs="Times New Roman"/>
+          <w:sz w:val="24"/>
+          <w:szCs w:val="24"/>
+          <w:lang w:val="el-GR"/>
+        </w:rPr>
+        <w:t xml:space="preserve">αλλά γίνεται και χειρότερη οπότε δεν χρειάζεται να διαλέξουμε τον πιο </w:t>
+      </w:r>
+      <w:r>
+        <w:rPr>
+          <w:rFonts w:ascii="Times New Roman" w:hAnsi="Times New Roman" w:cs="Times New Roman"/>
+          <w:sz w:val="24"/>
+          <w:szCs w:val="24"/>
+          <w:lang w:val="en-US"/>
+        </w:rPr>
+        <w:t>complex</w:t>
+      </w:r>
+      <w:r>
+        <w:rPr>
+          <w:rFonts w:ascii="Times New Roman" w:hAnsi="Times New Roman" w:cs="Times New Roman"/>
+          <w:sz w:val="24"/>
+          <w:szCs w:val="24"/>
+          <w:lang w:val="el-GR"/>
+        </w:rPr>
+        <w:t xml:space="preserve"> </w:t>
+      </w:r>
+      <w:r>
+        <w:rPr>
+          <w:rFonts w:ascii="Times New Roman" w:hAnsi="Times New Roman" w:cs="Times New Roman"/>
+          <w:sz w:val="24"/>
+          <w:szCs w:val="24"/>
+          <w:lang w:val="en-US"/>
+        </w:rPr>
+        <w:t>predictor</w:t>
+      </w:r>
+      <w:r>
+        <w:rPr>
+          <w:rFonts w:ascii="Times New Roman" w:hAnsi="Times New Roman" w:cs="Times New Roman"/>
+          <w:sz w:val="24"/>
+          <w:szCs w:val="24"/>
+          <w:lang w:val="el-GR"/>
+        </w:rPr>
+        <w:t>.)</w:t>
+      </w:r>
     </w:p>
     <w:sectPr>
       <w:pgSz w:w="12240" w:h="15840"/>

</xml_diff>